<commit_message>
Inner Child turn 115: the pass's block checks (no checked paragraph reads Low or AI; F03's second try), the docx with them, the records
Each changed block went through the API, predictions first (ledger #360 to #370, experiments/t115-api/
API-CHECKS.md). F03's first try left its permission sentence Human, Low, so its second try cut that clause
too, reviewed again. F09's check timed out ambiguously and isn't resent before the account's History is
checked. The docx shows each fix's check in its comment and marks the one sentence a block check read AI
that round 8 read High. Questions page, current state, handoff update, scorecards.

Co-Authored-By: Claude Opus 5.5 <noreply@anthropic.com>
Claude-Session: https://claude.ai/code/session_01NbUfhcTaRT8sbjyYV1wEFq
</commit_message>
<xml_diff>
--- a/articles/inner-child-therapy/experiments/t115-docx/inner-child-spots-round8.docx
+++ b/articles/inner-child-therapy/experiments/t115-docx/inner-child-spots-round8.docx
@@ -327,7 +327,21 @@
         <w:spacing w:after="160"/>
       </w:pPr>
       <w:r>
-        <w:t xml:space="preserve">Reparenting isn’t an exercise you finish, after all. Say your boss asks you to stay late again. You tell them no and go home feeling okay about it, and </w:t>
+        <w:t xml:space="preserve">Reparenting isn’t an exercise you finish, after al</w:t>
+      </w:r>
+      <w:commentRangeStart w:id="3"/>
+      <w:r>
+        <w:rPr>
+          <w:shd w:fill="BDD7EE" w:color="auto" w:val="clear"/>
+        </w:rPr>
+        <w:t xml:space="preserve">l. Say your boss asks you to stay late agai</w:t>
+      </w:r>
+      <w:commentRangeEnd w:id="3"/>
+      <w:r>
+        <w:commentReference w:id="3"/>
+      </w:r>
+      <w:r>
+        <w:t xml:space="preserve">n. You tell them no and go home feeling okay about it, and </w:t>
       </w:r>
       <w:r>
         <w:t xml:space="preserve">nobody had to cry on a meditation cushion for that to </w:t>
@@ -537,16 +551,16 @@
       <w:r>
         <w:t xml:space="preserve">Some manipulative people are too smart to act perfect. They lead with their wounds, or with how brutally honest they are about their flaws (very disarming, which is sort of the point), and every warning you hear about them just becomes more proof of how deep they are. </w:t>
       </w:r>
-      <w:commentRangeStart w:id="3"/>
+      <w:commentRangeStart w:id="4"/>
       <w:r>
         <w:rPr>
           <w:shd w:fill="E2ECF7" w:color="auto" w:val="clear"/>
         </w:rPr>
         <w:t xml:space="preserve">Your Protector has to catch the moment compassion starts explaining away what you’ve already seen.</w:t>
       </w:r>
-      <w:commentRangeEnd w:id="3"/>
-      <w:r>
-        <w:commentReference w:id="3"/>
+      <w:commentRangeEnd w:id="4"/>
+      <w:r>
+        <w:commentReference w:id="4"/>
       </w:r>
       <w:r>
         <w:t xml:space="preserve"> “I have honesty issues and I’m working on them” may be a perfectly honest thing to say. It’s also telling you there’s an honesty problem right now, and knowing about a problem isn’t fixing it.</w:t>
@@ -572,16 +586,16 @@
       <w:pPr>
         <w:spacing w:after="160"/>
       </w:pPr>
-      <w:commentRangeStart w:id="4"/>
+      <w:commentRangeStart w:id="5"/>
       <w:r>
         <w:rPr>
           <w:shd w:fill="BDD7EE" w:color="auto" w:val="clear"/>
         </w:rPr>
         <w:t xml:space="preserve">Borrow adulthood. Do not surrender it.</w:t>
       </w:r>
-      <w:commentRangeEnd w:id="4"/>
-      <w:r>
-        <w:commentReference w:id="4"/>
+      <w:commentRangeEnd w:id="5"/>
+      <w:r>
+        <w:commentReference w:id="5"/>
       </w:r>
     </w:p>
     <w:p>
@@ -759,16 +773,16 @@
       <w:r>
         <w:t xml:space="preserve">This part tends to scare the wrong people, like somebody who’s horrified by their own thoughts. Everybody gets scary thoughts they’d rather not have sometimes, and they don’t make you a bad person, but why would you bring your inner child into the middle of them? The nice thing about inner child therapy is that you can wait until you’re calm and actually ready. </w:t>
       </w:r>
-      <w:commentRangeStart w:id="5"/>
+      <w:commentRangeStart w:id="6"/>
       <w:r>
         <w:rPr>
           <w:shd w:fill="E2ECF7" w:color="auto" w:val="clear"/>
         </w:rPr>
         <w:t xml:space="preserve">A real parent doesn’t get to do that, which is one reason nobody manages to be a perfect one.</w:t>
       </w:r>
-      <w:commentRangeEnd w:id="5"/>
-      <w:r>
-        <w:commentReference w:id="5"/>
+      <w:commentRangeEnd w:id="6"/>
+      <w:r>
+        <w:commentReference w:id="6"/>
       </w:r>
     </w:p>
     <w:p>
@@ -882,16 +896,16 @@
       <w:r>
         <w:t xml:space="preserve">Think of someone you remember fondly. </w:t>
       </w:r>
-      <w:commentRangeStart w:id="6"/>
+      <w:commentRangeStart w:id="7"/>
       <w:r>
         <w:rPr>
           <w:shd w:fill="BDD7EE" w:color="auto" w:val="clear"/>
         </w:rPr>
         <w:t xml:space="preserve">How would they sit beside your little one?</w:t>
       </w:r>
-      <w:commentRangeEnd w:id="6"/>
-      <w:r>
-        <w:commentReference w:id="6"/>
+      <w:commentRangeEnd w:id="7"/>
+      <w:r>
+        <w:commentReference w:id="7"/>
       </w:r>
       <w:r>
         <w:t xml:space="preserve"> Just make sure it’s someone who liked you the way you were.</w:t>
@@ -909,16 +923,16 @@
       <w:pPr>
         <w:spacing w:after="160"/>
       </w:pPr>
-      <w:commentRangeStart w:id="7"/>
+      <w:commentRangeStart w:id="8"/>
       <w:r>
         <w:rPr>
           <w:shd w:fill="E2ECF7" w:color="auto" w:val="clear"/>
         </w:rPr>
         <w:t xml:space="preserve">Ask what a minimally competent adult would do here.</w:t>
       </w:r>
-      <w:commentRangeEnd w:id="7"/>
-      <w:r>
-        <w:commentReference w:id="7"/>
+      <w:commentRangeEnd w:id="8"/>
+      <w:r>
+        <w:commentReference w:id="8"/>
       </w:r>
       <w:r>
         <w:t xml:space="preserve"> Maybe something simple, like actually smelling that old food you’re about to eat and then trashing it if it smells a little weird. If you’re about to send an angry text, hit pause. If the room itself triggers your spidey sense, leave, or lock the door and get help. Even if this still feels like the child acting like the adult, for now, that’s ok. “Fake it til you make it” isn’t exactly it, but yeah. Afterward, you can tell your little one, “I did that for us. That was the Protector.” If it sounds funny, laugh!</w:t>
@@ -958,15 +972,15 @@
       <w:r>
         <w:t xml:space="preserve">That </w:t>
       </w:r>
-      <w:commentRangeStart w:id="8"/>
+      <w:commentRangeStart w:id="9"/>
       <w:del w:id="4" w:author="Claude" w:date="2026-10-26T14:00:00Z">
         <w:r>
           <w:delText xml:space="preserve">doesn’t close the door, though, it </w:delText>
         </w:r>
       </w:del>
-      <w:commentRangeEnd w:id="8"/>
-      <w:r>
-        <w:commentReference w:id="8"/>
+      <w:commentRangeEnd w:id="9"/>
+      <w:r>
+        <w:commentReference w:id="9"/>
       </w:r>
       <w:r>
         <w:t xml:space="preserve">just means you start smaller.</w:t>
@@ -1055,9 +1069,16 @@
         <w:spacing w:after="160"/>
       </w:pPr>
       <w:r>
-        <w:t xml:space="preserve">My father often suggested folks remember a similar-level (or even harder) challenge that they were able to handle. Maybe you survived a car crash and surgery a few years ago, but now you’re having trouble with emotional eating. You can draw strength from the past. As my sister, a historian, likes to say, “The past didn’t go anywhere.” Your own challenge doesn’t need to be as dramatic as a car crash, as long as it really happened. So who or what helped you get through it? Is one piece of that still within reach? If you catch yourself thinking “I survived a car crash, so why can’t I stop eating when I’m upset?”, that’s the past turned into a stick to hit yourself with. Maybe you’re more worn out now, or missing whatever helped back then. </w:t>
-      </w:r>
-      <w:commentRangeStart w:id="9"/>
+        <w:t xml:space="preserve">My father often suggested folks remember a similar-level (or even harder) challenge that they were able to handle. Maybe you survived a car crash and surgery a few years ago, but now you’re having trouble with emotional eating. You can draw strength from the past. As my sister, a historian, likes to say, “The past didn’t go anywhere.” Your own challenge doesn’t need to be as dramatic as a car crash, as long as it really happened. So who or what helped you get through it? Is one piece of that still within reach? If you catch yourself thinking “I survived a car crash, so why can’t I stop eating when I’m upset?”, that’s the past turned into a stick to hit yourself with. Maybe you’re more worn out now, or missing whatever helped back then.</w:t>
+      </w:r>
+      <w:commentRangeStart w:id="11"/>
+      <w:r>
+        <w:rPr>
+          <w:shd w:fill="BDD7EE" w:color="auto" w:val="clear"/>
+        </w:rPr>
+        <w:t xml:space="preserve"> </w:t>
+      </w:r>
+      <w:commentRangeStart w:id="10"/>
       <w:del w:id="5" w:author="Claude" w:date="2026-10-26T14:00:00Z">
         <w:r>
           <w:delText xml:space="preserve">(No example? </w:delText>
@@ -1070,12 +1091,19 @@
       </w:del>
       <w:ins w:id="7" w:author="Claude" w:date="2026-10-26T14:00:00Z">
         <w:r>
+          <w:rPr>
+            <w:shd w:fill="BDD7EE" w:color="auto" w:val="clear"/>
+          </w:rPr>
           <w:t xml:space="preserve">(If no example comes to mind, try another doorway.)</w:t>
         </w:r>
       </w:ins>
-      <w:commentRangeEnd w:id="9"/>
-      <w:r>
-        <w:commentReference w:id="9"/>
+      <w:commentRangeEnd w:id="11"/>
+      <w:r>
+        <w:commentReference w:id="11"/>
+      </w:r>
+      <w:commentRangeEnd w:id="10"/>
+      <w:r>
+        <w:commentReference w:id="10"/>
       </w:r>
     </w:p>
     <w:p>
@@ -1093,7 +1121,7 @@
       <w:r>
         <w:t xml:space="preserve">Some people hear all this about love and answer, “No. I hate myself.” </w:t>
       </w:r>
-      <w:commentRangeStart w:id="10"/>
+      <w:commentRangeStart w:id="12"/>
       <w:del w:id="8" w:author="Claude" w:date="2026-10-26T14:00:00Z">
         <w:r>
           <w:delText xml:space="preserve">If that’s what you find, it deserves an honest hearing. </w:delText>
@@ -1109,9 +1137,9 @@
           <w:t xml:space="preserve">If that’s what you find, just </w:t>
         </w:r>
       </w:ins>
-      <w:commentRangeEnd w:id="10"/>
-      <w:r>
-        <w:commentReference w:id="10"/>
+      <w:commentRangeEnd w:id="12"/>
+      <w:r>
+        <w:commentReference w:id="12"/>
       </w:r>
       <w:r>
         <w:t xml:space="preserve">listen to it, without arguing back.</w:t>
@@ -1124,21 +1152,32 @@
       <w:pPr>
         <w:spacing w:after="160"/>
       </w:pPr>
-      <w:r>
-        <w:t xml:space="preserve">What was it? It might have been hope, or desperation. Maybe you were curious, or scared. Some people come here out of duty. Or it was more like, “I’m not going to keep suffering like this.” </w:t>
+      <w:commentRangeStart w:id="14"/>
+      <w:r>
+        <w:rPr>
+          <w:shd w:fill="E4E4E4" w:color="auto" w:val="clear"/>
+        </w:rPr>
+        <w:t xml:space="preserve">What was it?</w:t>
+      </w:r>
+      <w:commentRangeEnd w:id="14"/>
+      <w:r>
+        <w:commentReference w:id="14"/>
+      </w:r>
+      <w:r>
+        <w:t xml:space="preserve"> It might have been hope, or desperation. Maybe you were curious, or scared. Some people come here out of duty. Or it was more like, “I’m not going to keep suffering like this.” </w:t>
       </w:r>
       <w:r>
         <w:t xml:space="preserve">And maybe it was love. </w:t>
       </w:r>
-      <w:commentRangeStart w:id="11"/>
+      <w:commentRangeStart w:id="13"/>
       <w:del w:id="11" w:author="Claude" w:date="2026-10-26T14:00:00Z">
         <w:r>
           <w:delText xml:space="preserve">You don’t need to decide which. </w:delText>
         </w:r>
       </w:del>
-      <w:commentRangeEnd w:id="11"/>
-      <w:r>
-        <w:commentReference w:id="11"/>
+      <w:commentRangeEnd w:id="13"/>
+      <w:r>
+        <w:commentReference w:id="13"/>
       </w:r>
       <w:r>
         <w:t xml:space="preserve">Ask that part</w:t>
@@ -1173,15 +1212,15 @@
       <w:r>
         <w:t xml:space="preserve">who’s just sitting there. </w:t>
       </w:r>
-      <w:commentRangeStart w:id="12"/>
+      <w:commentRangeStart w:id="15"/>
       <w:del w:id="12" w:author="Claude" w:date="2026-10-26T14:00:00Z">
         <w:r>
           <w:delText xml:space="preserve">And if nothing moves at all, don’t push it. </w:delText>
         </w:r>
       </w:del>
-      <w:commentRangeEnd w:id="12"/>
-      <w:r>
-        <w:commentReference w:id="12"/>
+      <w:commentRangeEnd w:id="15"/>
+      <w:r>
+        <w:commentReference w:id="15"/>
       </w:r>
       <w:r>
         <w:t xml:space="preserve">Knowing that love</w:t>
@@ -1205,7 +1244,7 @@
       <w:r>
         <w:t xml:space="preserve">Then take a small piece of whatever you’d tell them and </w:t>
       </w:r>
-      <w:commentRangeStart w:id="13"/>
+      <w:commentRangeStart w:id="16"/>
       <w:del w:id="13" w:author="Claude" w:date="2026-10-26T14:00:00Z">
         <w:r>
           <w:delText xml:space="preserve">hand </w:delText>
@@ -1261,9 +1300,9 @@
           <w:delText xml:space="preserve">That’s how you learn as a kid, and it works now, too. </w:delText>
         </w:r>
       </w:del>
-      <w:commentRangeEnd w:id="13"/>
-      <w:r>
-        <w:commentReference w:id="13"/>
+      <w:commentRangeEnd w:id="16"/>
+      <w:r>
+        <w:commentReference w:id="16"/>
       </w:r>
       <w:r>
         <w:t xml:space="preserve">The technical term</w:t>
@@ -1287,16 +1326,16 @@
       <w:r>
         <w:t xml:space="preserve">If the only time the Nurturer shows up is when something’s wrong, your little one can start to feel like they’re your job. Sometimes show up just to say “I’m glad you’re here,” and then enjoy them for a minute, the way you’d enjoy a little kid who wants to show you a rock they found. </w:t>
       </w:r>
-      <w:commentRangeStart w:id="14"/>
+      <w:commentRangeStart w:id="17"/>
       <w:r>
         <w:rPr>
           <w:shd w:fill="E2ECF7" w:color="auto" w:val="clear"/>
         </w:rPr>
         <w:t xml:space="preserve">Or picture the two of you washing the dishes together, nobody asking anybody how they feel.</w:t>
       </w:r>
-      <w:commentRangeEnd w:id="14"/>
-      <w:r>
-        <w:commentReference w:id="14"/>
+      <w:commentRangeEnd w:id="17"/>
+      <w:r>
+        <w:commentReference w:id="17"/>
       </w:r>
     </w:p>
     <w:p>
@@ -1450,16 +1489,16 @@
       <w:r>
         <w:t xml:space="preserve">If a spiritual teacher you trusted betrayed you, even sitting down to meditate can feel like it belongs to them now. </w:t>
       </w:r>
-      <w:commentRangeStart w:id="15"/>
+      <w:commentRangeStart w:id="18"/>
       <w:r>
         <w:rPr>
           <w:shd w:fill="E2ECF7" w:color="auto" w:val="clear"/>
         </w:rPr>
         <w:t xml:space="preserve">Kids quit piano over one bad teacher, and this is way worse.</w:t>
       </w:r>
-      <w:commentRangeEnd w:id="15"/>
-      <w:r>
-        <w:commentReference w:id="15"/>
+      <w:commentRangeEnd w:id="18"/>
+      <w:r>
+        <w:commentReference w:id="18"/>
       </w:r>
       <w:r>
         <w:t xml:space="preserve"> But if you let an abuser control your appreciation of life, then you’ve given them an unearned win.</w:t>
@@ -1615,16 +1654,16 @@
       <w:r>
         <w:t xml:space="preserve">When it’s your little one yelling at you, though, try not to turn “But I love you” into a line you say on cue, because then it can brush the anger off, and what it’s really saying is “so stop being angry.” I think you can mean it and still be doing that. </w:t>
       </w:r>
-      <w:commentRangeStart w:id="16"/>
+      <w:commentRangeStart w:id="19"/>
       <w:r>
         <w:rPr>
           <w:shd w:fill="BDD7EE" w:color="auto" w:val="clear"/>
         </w:rPr>
         <w:t xml:space="preserve">Does the love stay afterward and take whatever’s true in the anger seriously?</w:t>
       </w:r>
-      <w:commentRangeEnd w:id="16"/>
-      <w:r>
-        <w:commentReference w:id="16"/>
+      <w:commentRangeEnd w:id="19"/>
+      <w:r>
+        <w:commentReference w:id="19"/>
       </w:r>
     </w:p>
     <w:p>
@@ -1634,49 +1673,82 @@
       <w:r>
         <w:t xml:space="preserve">The love can stay, and your little one might still come back with “Big fuckity whoopty doo. I don’t believe you.” 🙄 You answer, “Okay. I believe that you don’t believe me. I still love you. 🤗 You don’t have to love me back. </w:t>
       </w:r>
-      <w:commentRangeStart w:id="17"/>
+      <w:commentRangeStart w:id="20"/>
       <w:r>
         <w:rPr>
           <w:shd w:fill="E2ECF7" w:color="auto" w:val="clear"/>
         </w:rPr>
         <w:t xml:space="preserve">Tell me what feels unsafe.”</w:t>
       </w:r>
-      <w:commentRangeEnd w:id="17"/>
-      <w:r>
-        <w:commentReference w:id="17"/>
-      </w:r>
-    </w:p>
-    <w:p>
-      <w:pPr>
-        <w:spacing w:after="160"/>
-      </w:pPr>
-      <w:r>
-        <w:t xml:space="preserve">Your little one might say it’s you. You don’t have to accept every conclusion they reach about you, but do listen for the concrete complaint </w:t>
-      </w:r>
-      <w:r>
-        <w:t xml:space="preserve">without fighting the yelling and swearing around it. </w:t>
-      </w:r>
-      <w:commentRangeStart w:id="18"/>
+      <w:commentRangeEnd w:id="20"/>
+      <w:r>
+        <w:commentReference w:id="20"/>
+      </w:r>
+    </w:p>
+    <w:p>
+      <w:pPr>
+        <w:spacing w:after="160"/>
+      </w:pPr>
+      <w:r>
+        <w:t xml:space="preserve">Your little one might say it’s you.</w:t>
+      </w:r>
+      <w:commentRangeStart w:id="22"/>
+      <w:r>
+        <w:rPr>
+          <w:shd w:fill="BDD7EE" w:color="auto" w:val="clear"/>
+        </w:rPr>
+        <w:t xml:space="preserve"> </w:t>
+      </w:r>
+      <w:commentRangeStart w:id="21"/>
       <w:del w:id="21" w:author="Claude" w:date="2026-10-26T14:00:00Z">
+        <w:r>
+          <w:delText xml:space="preserve">You don’t have to accept every conclusion they reach about you, but do listen </w:delText>
+        </w:r>
+      </w:del>
+      <w:ins w:id="22" w:author="Claude" w:date="2026-10-26T14:00:00Z">
+        <w:r>
+          <w:rPr>
+            <w:shd w:fill="BDD7EE" w:color="auto" w:val="clear"/>
+          </w:rPr>
+          <w:t xml:space="preserve">Listen </w:t>
+        </w:r>
+      </w:ins>
+      <w:r>
+        <w:rPr>
+          <w:shd w:fill="BDD7EE" w:color="auto" w:val="clear"/>
+        </w:rPr>
+        <w:t xml:space="preserve">for the concrete complaint without fighting the yelling and swearing around it. </w:t>
+      </w:r>
+      <w:del w:id="23" w:author="Claude" w:date="2026-10-26T14:00:00Z">
         <w:r>
           <w:delText xml:space="preserve">If it’s something serious, answer it seriously. </w:delText>
         </w:r>
       </w:del>
-      <w:del w:id="22" w:author="Claude" w:date="2026-10-26T14:00:00Z">
+      <w:del w:id="24" w:author="Claude" w:date="2026-10-26T14:00:00Z">
         <w:r>
           <w:delText xml:space="preserve">The complaint might only be one sentence, once the swearing runs out. </w:delText>
         </w:r>
       </w:del>
-      <w:commentRangeEnd w:id="18"/>
-      <w:r>
-        <w:commentReference w:id="18"/>
-      </w:r>
-      <w:r>
+      <w:commentRangeEnd w:id="21"/>
+      <w:r>
+        <w:commentReference w:id="21"/>
+      </w:r>
+      <w:r>
+        <w:rPr>
+          <w:shd w:fill="BDD7EE" w:color="auto" w:val="clear"/>
+        </w:rPr>
         <w:t xml:space="preserve">Like the anger</w:t>
       </w:r>
       <w:r>
+        <w:rPr>
+          <w:shd w:fill="BDD7EE" w:color="auto" w:val="clear"/>
+        </w:rPr>
         <w:t xml:space="preserve"> at bedtime, the swearing is there to get them heard, so once you’re listening instead of fighting, they don’t need it anymore.</w:t>
       </w:r>
+      <w:commentRangeEnd w:id="22"/>
+      <w:r>
+        <w:commentReference w:id="22"/>
+      </w:r>
     </w:p>
     <w:p>
       <w:pPr>
@@ -1700,7 +1772,18 @@
         <w:spacing w:after="160"/>
       </w:pPr>
       <w:r>
-        <w:t xml:space="preserve">Also notice what else in you answers your little one, besides what you choose to say. When they say “I don’t believe you,” something in you might fire back an accusation, and then they can learn your love is only there as long as they take it the right way. The resentment can be purely visceral: being doubted after you’ve tried feels unfair, but there’s nothing unfair in them going over your track record. The part that resents not being believed might be the same one that said “I love you” in the first place, or a different one, or a bit of both. Both talk in your grown-up voice, so to your little one they’re the same. Be careful not to take the accusation as proof your love really is conditional, when it could just be another part talking.</w:t>
+        <w:t xml:space="preserve">Also notice what else in you answers your little one, besides what you choose to say. When they say “I don’t believe you,” something in you might fire back an accusation, and then they can learn your love is only there as long as they take it the right way. The resentment can be purely visceral: being doubted after you’ve tried feels unfair, but there’s nothing unfair in them going over your track record. The part that resents not being believed might be the same one that said “I love you” in the first place, or a different one, or a bit of both. Both talk in your grown-up voice, so to your little one they’re the same. </w:t>
+      </w:r>
+      <w:commentRangeStart w:id="23"/>
+      <w:r>
+        <w:rPr>
+          <w:shd w:fill="F4A6A6" w:color="auto" w:val="clear"/>
+        </w:rPr>
+        <w:t xml:space="preserve">Be careful not to take the accusation as proof your love really is conditional, when it could just be another part talking.</w:t>
+      </w:r>
+      <w:commentRangeEnd w:id="23"/>
+      <w:r>
+        <w:commentReference w:id="23"/>
       </w:r>
     </w:p>
     <w:p>
@@ -1896,16 +1979,16 @@
       <w:pPr>
         <w:spacing w:after="160"/>
       </w:pPr>
-      <w:commentRangeStart w:id="19"/>
+      <w:commentRangeStart w:id="24"/>
       <w:r>
         <w:rPr>
           <w:shd w:fill="BDD7EE" w:color="auto" w:val="clear"/>
         </w:rPr>
         <w:t xml:space="preserve">Going back can still matter, even when nothing new turns up.</w:t>
       </w:r>
-      <w:commentRangeEnd w:id="19"/>
-      <w:r>
-        <w:commentReference w:id="19"/>
+      <w:commentRangeEnd w:id="24"/>
+      <w:r>
+        <w:commentReference w:id="24"/>
       </w:r>
       <w:r>
         <w:t xml:space="preserve"> But returning to the same wound can also become a search for certainty in an inherently uncertain existence. Spending all day asking, “Did I process it properly? Did I grieve it enough?” is clearly not what we’re after here.</w:t>
@@ -1915,16 +1998,16 @@
       <w:pPr>
         <w:spacing w:after="160"/>
       </w:pPr>
-      <w:commentRangeStart w:id="20"/>
+      <w:commentRangeStart w:id="25"/>
       <w:r>
         <w:rPr>
           <w:shd w:fill="BDD7EE" w:color="auto" w:val="clear"/>
         </w:rPr>
         <w:t xml:space="preserve">And the checking doesn’t always stay in your head.</w:t>
       </w:r>
-      <w:commentRangeEnd w:id="20"/>
-      <w:r>
-        <w:commentReference w:id="20"/>
+      <w:commentRangeEnd w:id="25"/>
+      <w:r>
+        <w:commentReference w:id="25"/>
       </w:r>
       <w:r>
         <w:t xml:space="preserve"> A body scan can turn into one, or a confession. Even, going on a date, or checking your dating profile matches, can be a version of this if what you’re really after is proof that you’re good and lovable. It might calm things down for a while, and then the next little wobble matters even more.</w:t>
@@ -2103,30 +2186,30 @@
       <w:pPr>
         <w:spacing w:after="160"/>
       </w:pPr>
-      <w:commentRangeStart w:id="21"/>
+      <w:commentRangeStart w:id="26"/>
       <w:r>
         <w:rPr>
           <w:shd w:fill="E2ECF7" w:color="auto" w:val="clear"/>
         </w:rPr>
         <w:t xml:space="preserve">And what if all that writing leaves you more confused than when you started?</w:t>
       </w:r>
-      <w:commentRangeEnd w:id="21"/>
-      <w:r>
-        <w:commentReference w:id="21"/>
+      <w:commentRangeEnd w:id="26"/>
+      <w:r>
+        <w:commentReference w:id="26"/>
       </w:r>
       <w:r>
         <w:t xml:space="preserve"> Then just keep track for a while, and save the patterns for later, if they turn out to matter at all. </w:t>
       </w:r>
-      <w:commentRangeStart w:id="22"/>
+      <w:commentRangeStart w:id="27"/>
       <w:r>
         <w:rPr>
           <w:shd w:fill="E2ECF7" w:color="auto" w:val="clear"/>
         </w:rPr>
         <w:t xml:space="preserve">A memory aid doesn’t have to explain your life.</w:t>
       </w:r>
-      <w:commentRangeEnd w:id="22"/>
-      <w:r>
-        <w:commentReference w:id="22"/>
+      <w:commentRangeEnd w:id="27"/>
+      <w:r>
+        <w:commentReference w:id="27"/>
       </w:r>
       <w:r>
         <w:t xml:space="preserve"> It could be a dated note of what happened, or of what helped. A reminder or a next step works too. Or you can leave yourself a voice note.</w:t>
@@ -2176,16 +2259,16 @@
       <w:pPr>
         <w:spacing w:after="160"/>
       </w:pPr>
-      <w:commentRangeStart w:id="23"/>
+      <w:commentRangeStart w:id="28"/>
       <w:r>
         <w:rPr>
           <w:shd w:fill="E2ECF7" w:color="auto" w:val="clear"/>
         </w:rPr>
         <w:t xml:space="preserve">Does saying it make the memory fiction?</w:t>
       </w:r>
-      <w:commentRangeEnd w:id="23"/>
-      <w:r>
-        <w:commentReference w:id="23"/>
+      <w:commentRangeEnd w:id="28"/>
+      <w:r>
+        <w:commentReference w:id="28"/>
       </w:r>
       <w:r>
         <w:t xml:space="preserve"> Well, no, it’s still what happened, as far as you remember it, even if some details turn out fuzzy. If the phrase does the trick, leave it at that, no need to narrate the whole thing.</w:t>
@@ -2195,30 +2278,30 @@
       <w:pPr>
         <w:spacing w:after="160"/>
       </w:pPr>
-      <w:commentRangeStart w:id="24"/>
+      <w:commentRangeStart w:id="29"/>
       <w:r>
         <w:rPr>
           <w:shd w:fill="BDD7EE" w:color="auto" w:val="clear"/>
         </w:rPr>
         <w:t xml:space="preserve">Do keep an ear on who’s narrating, though.</w:t>
       </w:r>
-      <w:commentRangeEnd w:id="24"/>
-      <w:r>
-        <w:commentReference w:id="24"/>
+      <w:commentRangeEnd w:id="29"/>
+      <w:r>
+        <w:commentReference w:id="29"/>
       </w:r>
       <w:r>
         <w:t xml:space="preserve"> If the voice starts sneering, like it’s making fun of the younger you, stop right there (that’s the courtroom creeping back in). Same if you feel more ashamed, or kind of floaty and unreal, since more distance won’t help with that. And when it goes well, it’s a good time to check in with the younger you in that story. </w:t>
       </w:r>
-      <w:commentRangeStart w:id="25"/>
+      <w:commentRangeStart w:id="30"/>
       <w:r>
         <w:rPr>
           <w:shd w:fill="E2ECF7" w:color="auto" w:val="clear"/>
         </w:rPr>
         <w:t xml:space="preserve">What do they need from you now?</w:t>
       </w:r>
-      <w:commentRangeEnd w:id="25"/>
-      <w:r>
-        <w:commentReference w:id="25"/>
+      <w:commentRangeEnd w:id="30"/>
+      <w:r>
+        <w:commentReference w:id="30"/>
       </w:r>
     </w:p>
     <w:p>
@@ -2260,16 +2343,16 @@
       <w:r>
         <w:t xml:space="preserve">“Where did I notice the hook?” At dinner with the in-laws? </w:t>
       </w:r>
-      <w:commentRangeStart w:id="26"/>
+      <w:commentRangeStart w:id="31"/>
       <w:r>
         <w:rPr>
           <w:shd w:fill="E2ECF7" w:color="auto" w:val="clear"/>
         </w:rPr>
         <w:t xml:space="preserve">Doom scrolling TikTok nonsense?</w:t>
       </w:r>
-      <w:commentRangeEnd w:id="26"/>
-      <w:r>
-        <w:commentReference w:id="26"/>
+      <w:commentRangeEnd w:id="31"/>
+      <w:r>
+        <w:commentReference w:id="31"/>
       </w:r>
       <w:r>
         <w:t xml:space="preserve"> Watching animé?</w:t>
@@ -2666,16 +2749,16 @@
       <w:r>
         <w:t xml:space="preserve">Anxiety is often a part of you that’s trying to protect you, making a guess about what’s coming, like that people will laugh at you. </w:t>
       </w:r>
-      <w:commentRangeStart w:id="27"/>
+      <w:commentRangeStart w:id="32"/>
       <w:r>
         <w:rPr>
           <w:shd w:fill="E2ECF7" w:color="auto" w:val="clear"/>
         </w:rPr>
         <w:t xml:space="preserve">It can be right!</w:t>
       </w:r>
-      <w:commentRangeEnd w:id="27"/>
-      <w:r>
-        <w:commentReference w:id="27"/>
+      <w:commentRangeEnd w:id="32"/>
+      <w:r>
+        <w:commentReference w:id="32"/>
       </w:r>
       <w:r>
         <w:t xml:space="preserve"> It’s probably been wrong before too, and you know some of those times. Unless it might be real danger, or something a doctor should look at, I’d go see.</w:t>
@@ -2768,30 +2851,30 @@
       <w:r>
         <w:t xml:space="preserve">It might say this will just be one more performance, and you’ll fool yourself again. </w:t>
       </w:r>
-      <w:commentRangeStart w:id="28"/>
+      <w:commentRangeStart w:id="33"/>
       <w:r>
         <w:rPr>
           <w:shd w:fill="E2ECF7" w:color="auto" w:val="clear"/>
         </w:rPr>
         <w:t xml:space="preserve">That one can sting, because there could be something to it. Maybe you’ve fooled yourself before, and that part remembers.</w:t>
       </w:r>
-      <w:commentRangeEnd w:id="28"/>
-      <w:r>
-        <w:commentReference w:id="28"/>
+      <w:commentRangeEnd w:id="33"/>
+      <w:r>
+        <w:commentReference w:id="33"/>
       </w:r>
       <w:r>
         <w:t xml:space="preserve"> “Tell me what you remember, I’m listening.” works well here. It puts you into the role of the Nurturer, which alleviates the instinct to argue back. Usually your little one only comes forward after that part feels heard. </w:t>
       </w:r>
-      <w:commentRangeStart w:id="29"/>
+      <w:commentRangeStart w:id="34"/>
       <w:r>
         <w:rPr>
           <w:shd w:fill="E2ECF7" w:color="auto" w:val="clear"/>
         </w:rPr>
         <w:t xml:space="preserve">Peek-a-boo! If you push past it, you might get exactly the performance it was afraid of.</w:t>
       </w:r>
-      <w:commentRangeEnd w:id="29"/>
-      <w:r>
-        <w:commentReference w:id="29"/>
+      <w:commentRangeEnd w:id="34"/>
+      <w:r>
+        <w:commentReference w:id="34"/>
       </w:r>
       <w:r>
         <w:t xml:space="preserve"> Even if you didn’t win an Emmy last year, that can look convincing, with the right words and maybe even tears, while nothing underneath feels any safer.</w:t>
@@ -2801,16 +2884,16 @@
       <w:pPr>
         <w:spacing w:after="160"/>
       </w:pPr>
-      <w:commentRangeStart w:id="30"/>
+      <w:commentRangeStart w:id="35"/>
       <w:r>
         <w:rPr>
           <w:shd w:fill="E2ECF7" w:color="auto" w:val="clear"/>
         </w:rPr>
         <w:t xml:space="preserve">A harder voice can seem more fitting for something that’s been in your way. I’d still keep the Nurturer voice.</w:t>
       </w:r>
-      <w:commentRangeEnd w:id="30"/>
-      <w:r>
-        <w:commentReference w:id="30"/>
+      <w:commentRangeEnd w:id="35"/>
+      <w:r>
+        <w:commentReference w:id="35"/>
       </w:r>
       <w:r>
         <w:t xml:space="preserve"> If that voice isn’t there in you yet, borrow it from someone who’s been safe for you.</w:t>
@@ -2831,16 +2914,16 @@
       <w:r>
         <w:t xml:space="preserve">A new roommate doesn’t win you over with a speech on move-in day (hopefully, right?). </w:t>
       </w:r>
-      <w:commentRangeStart w:id="31"/>
+      <w:commentRangeStart w:id="36"/>
       <w:r>
         <w:rPr>
           <w:shd w:fill="BDD7EE" w:color="auto" w:val="clear"/>
         </w:rPr>
         <w:t xml:space="preserve">The rent just has to keep showing up. Your Protector earns that guard’s trust about the same way, mostly out in ordinary life. The things you do can be small, like keeping a promise to yourself nobody else knew about. Or saying no to someone, and not texting an hour later to take it back.</w:t>
       </w:r>
-      <w:commentRangeEnd w:id="31"/>
-      <w:r>
-        <w:commentReference w:id="31"/>
+      <w:commentRangeEnd w:id="36"/>
+      <w:r>
+        <w:commentReference w:id="36"/>
       </w:r>
       <w:r>
         <w:t xml:space="preserve"> That second one can be really hard.</w:t>
@@ -3480,13 +3563,13 @@
       <w:r>
         <w:t xml:space="preserve">Do the same if you can’t stop yourself, </w:t>
       </w:r>
-      <w:commentRangeStart w:id="32"/>
-      <w:del w:id="23" w:author="Claude" w:date="2026-10-26T14:00:00Z">
+      <w:commentRangeStart w:id="37"/>
+      <w:del w:id="25" w:author="Claude" w:date="2026-10-26T14:00:00Z">
         <w:r>
           <w:delText xml:space="preserve">or </w:delText>
         </w:r>
       </w:del>
-      <w:ins w:id="24" w:author="Claude" w:date="2026-10-26T14:00:00Z">
+      <w:ins w:id="26" w:author="Claude" w:date="2026-10-26T14:00:00Z">
         <w:r>
           <w:t xml:space="preserve">and also when </w:t>
         </w:r>
@@ -3494,56 +3577,81 @@
       <w:r>
         <w:t xml:space="preserve">you’re badly disoriented or </w:t>
       </w:r>
-      <w:del w:id="25" w:author="Claude" w:date="2026-10-26T14:00:00Z">
+      <w:del w:id="27" w:author="Claude" w:date="2026-10-26T14:00:00Z">
         <w:r>
           <w:delText xml:space="preserve">intoxicated. </w:delText>
         </w:r>
       </w:del>
-      <w:ins w:id="26" w:author="Claude" w:date="2026-10-26T14:00:00Z">
+      <w:ins w:id="28" w:author="Claude" w:date="2026-10-26T14:00:00Z">
         <w:r>
-          <w:t xml:space="preserve">intoxicated, or can’t tell whether any of this is you. </w:t>
+          <w:t xml:space="preserve">intoxicated, or can’t tell whether any of this is you.</w:t>
         </w:r>
       </w:ins>
-      <w:del w:id="27" w:author="Claude" w:date="2026-10-26T14:00:00Z">
+      <w:commentRangeStart w:id="38"/>
+      <w:ins w:id="29" w:author="Claude" w:date="2026-10-26T14:00:00Z">
+        <w:r>
+          <w:rPr>
+            <w:shd w:fill="BDD7EE" w:color="auto" w:val="clear"/>
+          </w:rPr>
+          <w:t xml:space="preserve"> </w:t>
+        </w:r>
+      </w:ins>
+      <w:del w:id="30" w:author="Claude" w:date="2026-10-26T14:00:00Z">
         <w:r>
           <w:delText xml:space="preserve">Can’t tell if that’s you? </w:delText>
         </w:r>
       </w:del>
-      <w:del w:id="28" w:author="Claude" w:date="2026-10-26T14:00:00Z">
+      <w:del w:id="31" w:author="Claude" w:date="2026-10-26T14:00:00Z">
         <w:r>
           <w:delText xml:space="preserve">Treat it like it is. </w:delText>
         </w:r>
       </w:del>
-      <w:del w:id="29" w:author="Claude" w:date="2026-10-26T14:00:00Z">
+      <w:del w:id="32" w:author="Claude" w:date="2026-10-26T14:00:00Z">
         <w:r>
           <w:delText xml:space="preserve">None of that is me answering whether life is worth living. </w:delText>
         </w:r>
       </w:del>
-      <w:del w:id="30" w:author="Claude" w:date="2026-10-26T14:00:00Z">
+      <w:del w:id="33" w:author="Claude" w:date="2026-10-26T14:00:00Z">
         <w:r>
           <w:delText xml:space="preserve">It just </w:delText>
         </w:r>
       </w:del>
-      <w:ins w:id="31" w:author="Claude" w:date="2026-10-26T14:00:00Z">
+      <w:ins w:id="34" w:author="Claude" w:date="2026-10-26T14:00:00Z">
         <w:r>
+          <w:rPr>
+            <w:shd w:fill="BDD7EE" w:color="auto" w:val="clear"/>
+          </w:rPr>
           <w:t xml:space="preserve">Getting safe first </w:t>
         </w:r>
       </w:ins>
       <w:r>
+        <w:rPr>
+          <w:shd w:fill="BDD7EE" w:color="auto" w:val="clear"/>
+        </w:rPr>
         <w:t xml:space="preserve">keeps the question </w:t>
       </w:r>
-      <w:ins w:id="32" w:author="Claude" w:date="2026-10-26T14:00:00Z">
+      <w:ins w:id="35" w:author="Claude" w:date="2026-10-26T14:00:00Z">
         <w:r>
+          <w:rPr>
+            <w:shd w:fill="BDD7EE" w:color="auto" w:val="clear"/>
+          </w:rPr>
           <w:t xml:space="preserve">of whether life is worth living </w:t>
         </w:r>
       </w:ins>
-      <w:commentRangeEnd w:id="32"/>
-      <w:r>
-        <w:commentReference w:id="32"/>
-      </w:r>
-      <w:r>
+      <w:commentRangeEnd w:id="37"/>
+      <w:r>
+        <w:commentReference w:id="37"/>
+      </w:r>
+      <w:r>
+        <w:rPr>
+          <w:shd w:fill="BDD7EE" w:color="auto" w:val="clear"/>
+        </w:rPr>
         <w:t xml:space="preserve">open long enough to look at.</w:t>
       </w:r>
+      <w:commentRangeEnd w:id="38"/>
+      <w:r>
+        <w:commentReference w:id="38"/>
+      </w:r>
     </w:p>
     <w:p>
       <w:pPr>
@@ -3552,16 +3660,16 @@
       <w:r>
         <w:t xml:space="preserve">Then, before getting all philosophical, make sure there’s a real, live grown-up in the room or on the phone, if that’s possible. And as for the internal psychology of it, when the part that wants to die feels like all of you, go ahead and notice who’s doing the noticing (as we discussed in Noticing Counts), or borrow an adult from the adult lending library in your head :). </w:t>
       </w:r>
-      <w:commentRangeStart w:id="33"/>
+      <w:commentRangeStart w:id="39"/>
       <w:r>
         <w:rPr>
           <w:shd w:fill="FFD966" w:color="auto" w:val="clear"/>
         </w:rPr>
         <w:t xml:space="preserve">Any part of you that can help keep your body safe, or would rather wait on a decision you can’t undo, is welcome. And if none of them shows up yet? No problem, the questions can wait.</w:t>
       </w:r>
-      <w:commentRangeEnd w:id="33"/>
-      <w:r>
-        <w:commentReference w:id="33"/>
+      <w:commentRangeEnd w:id="39"/>
+      <w:r>
+        <w:commentReference w:id="39"/>
       </w:r>
     </w:p>
     <w:p>
@@ -3628,16 +3736,16 @@
       <w:r>
         <w:t xml:space="preserve">My father used to tell suicidal people, “Oh, you want to kill yourself? That’s wonderful! Now you can change what you’ve always been too afraid to change in your life, and then see if you still want to end it!” So, what would you tell my dad? What’s the change you still can’t bring yourself to make? </w:t>
       </w:r>
-      <w:commentRangeStart w:id="34"/>
+      <w:commentRangeStart w:id="40"/>
       <w:r>
         <w:rPr>
           <w:shd w:fill="E2ECF7" w:color="auto" w:val="clear"/>
         </w:rPr>
         <w:t xml:space="preserve">Leaving a relationship? Quitting a job?</w:t>
       </w:r>
-      <w:commentRangeEnd w:id="34"/>
-      <w:r>
-        <w:commentReference w:id="34"/>
+      <w:commentRangeEnd w:id="40"/>
+      <w:r>
+        <w:commentReference w:id="40"/>
       </w:r>
       <w:r>
         <w:t xml:space="preserve"> Telling your family who you really are? Those might sound difficult, but they’re actually considerably more likely to help than dying.</w:t>
@@ -3730,16 +3838,16 @@
       <w:r>
         <w:t xml:space="preserve">So early on, the practice is finding out who’s actually in there, through long reflection with no outside input, and journaling just for yourself, without picturing a reader. </w:t>
       </w:r>
-      <w:commentRangeStart w:id="35"/>
+      <w:commentRangeStart w:id="41"/>
       <w:r>
         <w:rPr>
           <w:shd w:fill="BDD7EE" w:color="auto" w:val="clear"/>
         </w:rPr>
         <w:t xml:space="preserve">You might catch yourself explaining who everybody is anyway.</w:t>
       </w:r>
-      <w:commentRangeEnd w:id="35"/>
-      <w:r>
-        <w:commentReference w:id="35"/>
+      <w:commentRangeEnd w:id="41"/>
+      <w:r>
+        <w:commentReference w:id="41"/>
       </w:r>
       <w:r>
         <w:t xml:space="preserve"> Time alone in nature helps too, and so does getting back the preferences that got buried: the foods you really like and what feels good to do, and what you believe and feel when nobody’s around to take your cues from. Focusing (Eugene Gendlin’s method of listening to a vague, felt sense in your body) can especially help you notice feelings and preferences the part you’ve been playing learned to overlook. Any words you put to them can stay tentative (”I hate cooking... or just for everybody?”) while you look at what they seem to mean and revise how you read them.</w:t>
@@ -3760,30 +3868,30 @@
       <w:r>
         <w:t xml:space="preserve">Part of building who you are is untangling yourself from whatever pulls you away from your own knowing in return for belonging. A political tribe might expect consistent positions and predictable reactions, while a family or religion that’s kind to you might have expectations that just feel like being good. </w:t>
       </w:r>
-      <w:commentRangeStart w:id="36"/>
+      <w:commentRangeStart w:id="42"/>
       <w:r>
         <w:rPr>
           <w:shd w:fill="BDD7EE" w:color="auto" w:val="clear"/>
         </w:rPr>
         <w:t xml:space="preserve">Most groups expect some conformity.</w:t>
       </w:r>
-      <w:commentRangeEnd w:id="36"/>
-      <w:r>
-        <w:commentReference w:id="36"/>
+      <w:commentRangeEnd w:id="42"/>
+      <w:r>
+        <w:commentReference w:id="42"/>
       </w:r>
       <w:r>
         <w:t xml:space="preserve"> Your family might want a particular kind of son or daughter, and your friends might have rules about what you can joke about or get upset about. </w:t>
       </w:r>
-      <w:commentRangeStart w:id="37"/>
+      <w:commentRangeStart w:id="43"/>
       <w:r>
         <w:rPr>
           <w:shd w:fill="E2ECF7" w:color="auto" w:val="clear"/>
         </w:rPr>
         <w:t xml:space="preserve">But if going along means betraying yourself, that’s the bargain.</w:t>
       </w:r>
-      <w:commentRangeEnd w:id="37"/>
-      <w:r>
-        <w:commentReference w:id="37"/>
+      <w:commentRangeEnd w:id="43"/>
+      <w:r>
+        <w:commentReference w:id="43"/>
       </w:r>
       <w:r>
         <w:t xml:space="preserve"> It can help to write down the rules your family ran on, including unspoken ones like “Boys don’t cry.” Then write down the role you got handed, like the stand-in parent, or the one who got blamed for everything (ST-CA has lists of both, in sections 15.2.3 and 15.2.4).</w:t>
@@ -3913,16 +4021,16 @@
       <w:r>
         <w:t xml:space="preserve">You don’t have to stop enjoying pleasure, praise, gain or belonging. </w:t>
       </w:r>
-      <w:commentRangeStart w:id="38"/>
+      <w:commentRangeStart w:id="44"/>
       <w:r>
         <w:rPr>
           <w:shd w:fill="BDD7EE" w:color="auto" w:val="clear"/>
         </w:rPr>
         <w:t xml:space="preserve">The question is whether losing one of them would feel like losing yourself.</w:t>
       </w:r>
-      <w:commentRangeEnd w:id="38"/>
-      <w:r>
-        <w:commentReference w:id="38"/>
+      <w:commentRangeEnd w:id="44"/>
+      <w:r>
+        <w:commentReference w:id="44"/>
       </w:r>
     </w:p>
     <w:p>
@@ -3940,16 +4048,16 @@
       <w:r>
         <w:t xml:space="preserve">Differentiation can happen right inside a family, religion, community or relationship. </w:t>
       </w:r>
-      <w:commentRangeStart w:id="39"/>
+      <w:commentRangeStart w:id="45"/>
       <w:r>
         <w:rPr>
           <w:shd w:fill="BDD7EE" w:color="auto" w:val="clear"/>
         </w:rPr>
         <w:t xml:space="preserve">You’d still belong, just selectively.</w:t>
       </w:r>
-      <w:commentRangeEnd w:id="39"/>
-      <w:r>
-        <w:commentReference w:id="39"/>
+      <w:commentRangeEnd w:id="45"/>
+      <w:r>
+        <w:commentReference w:id="45"/>
       </w:r>
       <w:r>
         <w:t xml:space="preserve"> As a differentiated adult you can stay deeply embedded, free to question things or disagree. If a parent used to go quiet and hurt whenever you disagreed, that might be hard to believe. A family where everyone gets to be their own person is healthier than an enmeshed one, and a faith that’s your own is healthier than religious compliance. It can be the same religion either way. And two differentiated people have a sturdier relationship than two who’ve been absorbed into each other.</w:t>
@@ -4027,16 +4135,16 @@
       <w:r>
         <w:t xml:space="preserve"> For identity you also need some experiments out in real life, so go try something new just for you. Maybe a foraging group, or a painting class. Stargazing can be awe-inspiring, and you might even see a UFO! </w:t>
       </w:r>
-      <w:commentRangeStart w:id="40"/>
+      <w:commentRangeStart w:id="46"/>
       <w:r>
         <w:rPr>
           <w:shd w:fill="E2ECF7" w:color="auto" w:val="clear"/>
         </w:rPr>
         <w:t xml:space="preserve">Notice what holds your attention when nobody is impressed.</w:t>
       </w:r>
-      <w:commentRangeEnd w:id="40"/>
-      <w:r>
-        <w:commentReference w:id="40"/>
+      <w:commentRangeEnd w:id="46"/>
+      <w:r>
+        <w:commentReference w:id="46"/>
       </w:r>
     </w:p>
     <w:p>
@@ -4118,16 +4226,16 @@
       <w:r>
         <w:t xml:space="preserve">Once a need does show, after all that hiding, it’s okay to want a lot of closeness. So then someone you love goes for a walk alone, and you’ve texted “hello??” before they’re at the corner. When they get back, you sulk all night. </w:t>
       </w:r>
-      <w:commentRangeStart w:id="41"/>
+      <w:commentRangeStart w:id="47"/>
       <w:r>
         <w:rPr>
           <w:shd w:fill="E2ECF7" w:color="auto" w:val="clear"/>
         </w:rPr>
         <w:t xml:space="preserve">Wanting them close is fine!</w:t>
       </w:r>
-      <w:commentRangeEnd w:id="41"/>
-      <w:r>
-        <w:commentReference w:id="41"/>
+      <w:commentRangeEnd w:id="47"/>
+      <w:r>
+        <w:commentReference w:id="47"/>
       </w:r>
       <w:r>
         <w:t xml:space="preserve"> But they get to go for a walk too. Ask your little one what it’s afraid of. I think it just wants to know they’re coming back. Then the Guide can come up with something like “See you in an hour?”</w:t>
@@ -4156,16 +4264,16 @@
       <w:r>
         <w:t xml:space="preserve">Forced adulthood can get into your head too, where it wants everything as spotless as that kitchen. At your grandpa’s funeral, some dumb jingle starts up in your head and you nearly laugh during the eulogy. That doesn’t mean you didn’t love him, or that something’s wrong with you. Minds come up with ugly and embarrassing stuff all the time, some of it the opposite of what you believe, and bodies do their own thing too. </w:t>
       </w:r>
-      <w:commentRangeStart w:id="42"/>
+      <w:commentRangeStart w:id="48"/>
       <w:r>
         <w:rPr>
           <w:shd w:fill="E2ECF7" w:color="auto" w:val="clear"/>
         </w:rPr>
         <w:t xml:space="preserve">The Guide isn’t there to police every thought.</w:t>
       </w:r>
-      <w:commentRangeEnd w:id="42"/>
-      <w:r>
-        <w:commentReference w:id="42"/>
+      <w:commentRangeEnd w:id="48"/>
+      <w:r>
+        <w:commentReference w:id="48"/>
       </w:r>
       <w:r>
         <w:t xml:space="preserve"> It notices the jingle and knows you didn’t mean it, and that it isn’t who you are. Then it goes with what you’d stand behind, which here is probably squeezing your mom’s hand and listening, and lets the jingle go.</w:t>
@@ -4367,16 +4475,16 @@
       <w:pPr>
         <w:spacing w:after="160"/>
       </w:pPr>
-      <w:commentRangeStart w:id="43"/>
+      <w:commentRangeStart w:id="49"/>
       <w:r>
         <w:rPr>
           <w:shd w:fill="BDD7EE" w:color="auto" w:val="clear"/>
         </w:rPr>
         <w:t xml:space="preserve">The same goes for doctors.</w:t>
       </w:r>
-      <w:commentRangeEnd w:id="43"/>
-      <w:r>
-        <w:commentReference w:id="43"/>
+      <w:commentRangeEnd w:id="49"/>
+      <w:r>
+        <w:commentReference w:id="49"/>
       </w:r>
       <w:r>
         <w:t xml:space="preserve"> No need to give them a good impression if that means not being your own advocate. If you don’t feel up to it, bring someone you trust to speak up for you (it doesn’t have to be the relative who never respected your wishes), and ask what a treatment’s for.</w:t>
@@ -4394,44 +4502,44 @@
       <w:pPr>
         <w:spacing w:after="160"/>
       </w:pPr>
-      <w:commentRangeStart w:id="44"/>
+      <w:commentRangeStart w:id="50"/>
       <w:r>
         <w:rPr>
           <w:shd w:fill="BDD7EE" w:color="auto" w:val="clear"/>
         </w:rPr>
         <w:t xml:space="preserve">And reaching out doesn’t mean </w:t>
       </w:r>
-      <w:commentRangeStart w:id="46"/>
+      <w:commentRangeStart w:id="52"/>
       <w:r>
         <w:rPr>
           <w:shd w:fill="BDD7EE" w:color="auto" w:val="clear"/>
         </w:rPr>
         <w:t xml:space="preserve">telling strangers everything. Privacy isn’t fakery.</w:t>
       </w:r>
-      <w:commentRangeEnd w:id="44"/>
-      <w:r>
-        <w:commentReference w:id="44"/>
+      <w:commentRangeEnd w:id="50"/>
+      <w:r>
+        <w:commentReference w:id="50"/>
       </w:r>
       <w:r>
         <w:t xml:space="preserve"> People can earn</w:t>
       </w:r>
-      <w:commentRangeEnd w:id="46"/>
-      <w:r>
-        <w:commentReference w:id="46"/>
+      <w:commentRangeEnd w:id="52"/>
+      <w:r>
+        <w:commentReference w:id="52"/>
       </w:r>
       <w:r>
         <w:t xml:space="preserve"> more of you by how they handle the smaller stuff, like whether that thing you told them about your weird fear of birds turns into a joke at the next party 🙈, and how they take it when you say no. But if a relationship is getting deep and you’re still keeping up a fake normal, happy version of yourself to hold onto it, I’d either bring more of the truth in, carefully, or let it be less deep for now. </w:t>
       </w:r>
-      <w:commentRangeStart w:id="45"/>
+      <w:commentRangeStart w:id="51"/>
       <w:r>
         <w:rPr>
           <w:shd w:fill="BDD7EE" w:color="auto" w:val="clear"/>
         </w:rPr>
         <w:t xml:space="preserve">(If telling could put you in real danger, like violence, or being outed where that isn’t safe, protect yourself first.) And when someone finally accepts you, it can feel amazing.</w:t>
       </w:r>
-      <w:commentRangeEnd w:id="45"/>
-      <w:r>
-        <w:commentReference w:id="45"/>
+      <w:commentRangeEnd w:id="51"/>
+      <w:r>
+        <w:commentReference w:id="51"/>
       </w:r>
       <w:r>
         <w:t xml:space="preserve"> It still doesn’t prove you’re meant for each other, or that they’ve earned your trust yet.</w:t>
@@ -4452,16 +4560,16 @@
       <w:r>
         <w:t xml:space="preserve">Then there’s the stuff that’s hardest to tell anyone, and of course that’s exactly what you need help with. </w:t>
       </w:r>
-      <w:commentRangeStart w:id="47"/>
+      <w:commentRangeStart w:id="53"/>
       <w:r>
         <w:rPr>
           <w:shd w:fill="BDD7EE" w:color="auto" w:val="clear"/>
         </w:rPr>
         <w:t xml:space="preserve">Maybe it’s an urge that scares you, or something you did that could get you in legal trouble.</w:t>
       </w:r>
-      <w:commentRangeEnd w:id="47"/>
-      <w:r>
-        <w:commentReference w:id="47"/>
+      <w:commentRangeEnd w:id="53"/>
+      <w:r>
+        <w:commentReference w:id="53"/>
       </w:r>
       <w:r>
         <w:t xml:space="preserve"> I’d assume that what you tell won’t be completely confidential, especially if it sounds like something dangerous.</w:t>
@@ -4471,16 +4579,16 @@
       <w:pPr>
         <w:spacing w:after="160"/>
       </w:pPr>
-      <w:commentRangeStart w:id="48"/>
+      <w:commentRangeStart w:id="54"/>
       <w:r>
         <w:rPr>
           <w:shd w:fill="E2ECF7" w:color="auto" w:val="clear"/>
         </w:rPr>
         <w:t xml:space="preserve">You know that DM you deleted?</w:t>
       </w:r>
-      <w:commentRangeEnd w:id="48"/>
-      <w:r>
-        <w:commentReference w:id="48"/>
+      <w:commentRangeEnd w:id="54"/>
+      <w:r>
+        <w:commentReference w:id="54"/>
       </w:r>
       <w:r>
         <w:t xml:space="preserve"> It can still be sitting on their phone as a screenshot 🙈, and whatever’s on a company’s server can get handed over if a court asks. </w:t>
@@ -4633,16 +4741,16 @@
       <w:r>
         <w:t xml:space="preserve">You can mean the apology for a start. </w:t>
       </w:r>
-      <w:commentRangeStart w:id="49"/>
+      <w:commentRangeStart w:id="55"/>
       <w:r>
         <w:rPr>
           <w:shd w:fill="BDD7EE" w:color="auto" w:val="clear"/>
         </w:rPr>
         <w:t xml:space="preserve">Then notice what happens next.</w:t>
       </w:r>
-      <w:commentRangeEnd w:id="49"/>
-      <w:r>
-        <w:commentReference w:id="49"/>
+      <w:commentRangeEnd w:id="55"/>
+      <w:r>
+        <w:commentReference w:id="55"/>
       </w:r>
       <w:r>
         <w:t xml:space="preserve"> Are you sorry for what you did, or are you starting to take back the complaint too because they’re still upset? Maybe your first explanation sucked. </w:t>
@@ -4738,20 +4846,20 @@
       <w:r>
         <w:t xml:space="preserve">Before sending anything, I’d read it once as if I were them, sitting there with my phone. </w:t>
       </w:r>
-      <w:commentRangeStart w:id="50"/>
-      <w:del w:id="33" w:author="Claude" w:date="2026-10-26T14:00:00Z">
+      <w:commentRangeStart w:id="56"/>
+      <w:del w:id="36" w:author="Claude" w:date="2026-10-26T14:00:00Z">
         <w:r>
           <w:delText xml:space="preserve">What felt scared when I wrote it can read like a threat from over there.</w:delText>
         </w:r>
       </w:del>
-      <w:ins w:id="34" w:author="Claude" w:date="2026-10-26T14:00:00Z">
+      <w:ins w:id="37" w:author="Claude" w:date="2026-10-26T14:00:00Z">
         <w:r>
           <w:t xml:space="preserve">Stuff I wrote while I was scared can sound like a threat to them.</w:t>
         </w:r>
       </w:ins>
-      <w:commentRangeEnd w:id="50"/>
-      <w:r>
-        <w:commentReference w:id="50"/>
+      <w:commentRangeEnd w:id="56"/>
+      <w:r>
+        <w:commentReference w:id="56"/>
       </w:r>
     </w:p>
     <w:p>
@@ -4809,16 +4917,16 @@
       <w:r>
         <w:t xml:space="preserve">The basic premise of Hearthwork, my peer-counseling framework, is: Equal time. Attention without interpretation, advice, or fixing. </w:t>
       </w:r>
-      <w:commentRangeStart w:id="51"/>
+      <w:commentRangeStart w:id="57"/>
       <w:r>
         <w:rPr>
           <w:shd w:fill="BDD7EE" w:color="auto" w:val="clear"/>
         </w:rPr>
         <w:t xml:space="preserve">You speak. I listen. Then we switch.</w:t>
       </w:r>
-      <w:commentRangeEnd w:id="51"/>
-      <w:r>
-        <w:commentReference w:id="51"/>
+      <w:commentRangeEnd w:id="57"/>
+      <w:r>
+        <w:commentReference w:id="57"/>
       </w:r>
       <w:r>
         <w:t xml:space="preserve"> Presence, Warmth, Discipline, Confidentiality. It’s kind of a third type of relationship, alongside ordinary friendship and professional therapy, and one your little one might really need, because modern life rarely gives you anything like it.</w:t>
@@ -4836,16 +4944,16 @@
       <w:pPr>
         <w:spacing w:after="160"/>
       </w:pPr>
-      <w:commentRangeStart w:id="52"/>
+      <w:commentRangeStart w:id="58"/>
       <w:r>
         <w:rPr>
           <w:shd w:fill="BDD7EE" w:color="auto" w:val="clear"/>
         </w:rPr>
         <w:t xml:space="preserve">The peer doesn’t become your permanent parent, though.</w:t>
       </w:r>
-      <w:commentRangeEnd w:id="52"/>
-      <w:r>
-        <w:commentReference w:id="52"/>
+      <w:commentRangeEnd w:id="58"/>
+      <w:r>
+        <w:commentReference w:id="58"/>
       </w:r>
       <w:r>
         <w:t xml:space="preserve"> They show you a capacity, help you get the hang of it, and give it back to you, which is borrowed adulthood in its healthiest form (a driving instructor isn’t planning to drive you around forever either). </w:t>
@@ -4907,16 +5015,16 @@
       <w:r>
         <w:t xml:space="preserve">The understanding that helps me is seeing how a person’s conditioning, history, pain, and capacity shaped the harmful move they made. Picture everything that had made them who they were by that moment, what happened to them and what they learned, the pain they carried and what they could and couldn’t handle. From in there, it was the only move they had. </w:t>
       </w:r>
-      <w:commentRangeStart w:id="53"/>
+      <w:commentRangeStart w:id="59"/>
       <w:r>
         <w:rPr>
           <w:shd w:fill="E2ECF7" w:color="auto" w:val="clear"/>
         </w:rPr>
         <w:t xml:space="preserve">Hurt people often pass on pain they never worked through.</w:t>
       </w:r>
-      <w:commentRangeEnd w:id="53"/>
-      <w:r>
-        <w:commentReference w:id="53"/>
+      <w:commentRangeEnd w:id="59"/>
+      <w:r>
+        <w:commentReference w:id="59"/>
       </w:r>
       <w:r>
         <w:t xml:space="preserve"> You may have heard that from somebody telling you to forgive. When you see it for yourself, though, you might find yourself forgiving them, and if you’ve held them uniquely to blame, the rage can soften into something more accurate.</w:t>
@@ -4929,47 +5037,61 @@
       <w:r>
         <w:t xml:space="preserve">They still have to answer for what they did, and it still </w:t>
       </w:r>
-      <w:commentRangeStart w:id="54"/>
-      <w:del w:id="35" w:author="Claude" w:date="2026-10-26T14:00:00Z">
+      <w:commentRangeStart w:id="60"/>
+      <w:del w:id="38" w:author="Claude" w:date="2026-10-26T14:00:00Z">
         <w:r>
           <w:delText xml:space="preserve">hurt. </w:delText>
         </w:r>
       </w:del>
-      <w:ins w:id="36" w:author="Claude" w:date="2026-10-26T14:00:00Z">
+      <w:ins w:id="39" w:author="Claude" w:date="2026-10-26T14:00:00Z">
         <w:r>
           <w:t xml:space="preserve">hurt, even if you see how they got there. </w:t>
         </w:r>
       </w:ins>
-      <w:del w:id="37" w:author="Claude" w:date="2026-10-26T14:00:00Z">
+      <w:del w:id="40" w:author="Claude" w:date="2026-10-26T14:00:00Z">
         <w:r>
           <w:delText xml:space="preserve">Seeing how they got there doesn’t make it okay. </w:delText>
         </w:r>
       </w:del>
-      <w:commentRangeEnd w:id="54"/>
-      <w:r>
-        <w:commentReference w:id="54"/>
+      <w:commentRangeEnd w:id="60"/>
+      <w:r>
+        <w:commentReference w:id="60"/>
       </w:r>
       <w:r>
         <w:t xml:space="preserve">It’s just that</w:t>
       </w:r>
       <w:r>
-        <w:t xml:space="preserve"> punishing them now can’t reach back and give them what they were missing then, the sense to see it or the help. Or the skills. What’s left is fixing what can be fixed, and making it easier for something different to happen now.</w:t>
-      </w:r>
-    </w:p>
-    <w:p>
-      <w:pPr>
-        <w:spacing w:after="160"/>
-      </w:pPr>
-      <w:commentRangeStart w:id="55"/>
+        <w:t xml:space="preserve"> punishing them now can’t reach back and give them what they were missing then, the sense to see it or the help.</w:t>
+      </w:r>
+      <w:commentRangeStart w:id="61"/>
+      <w:r>
+        <w:rPr>
+          <w:shd w:fill="E4E4E4" w:color="auto" w:val="clear"/>
+        </w:rPr>
+        <w:t xml:space="preserve"> Or the skills.</w:t>
+      </w:r>
+      <w:commentRangeEnd w:id="61"/>
+      <w:r>
+        <w:commentReference w:id="61"/>
+      </w:r>
+      <w:r>
+        <w:t xml:space="preserve"> What’s left is fixing what can be fixed, and making it easier for something different to happen now.</w:t>
+      </w:r>
+    </w:p>
+    <w:p>
+      <w:pPr>
+        <w:spacing w:after="160"/>
+      </w:pPr>
+      <w:commentRangeStart w:id="62"/>
       <w:r>
         <w:rPr>
           <w:shd w:fill="BDD7EE" w:color="auto" w:val="clear"/>
         </w:rPr>
         <w:t xml:space="preserve">So a boundary can still be right.</w:t>
       </w:r>
-      <w:commentRangeEnd w:id="55"/>
-      <w:r>
-        <w:commentReference w:id="55"/>
+      <w:commentRangeEnd w:id="62"/>
+      <w:r>
+        <w:commentReference w:id="62"/>
       </w:r>
       <w:r>
         <w:t xml:space="preserve"> So can the law, if it comes to that, or telling them plainly it was wrong (or telling yourself, if they’d never hear it). Keeping away from them for good can be right too, and you can still forgive them from over there. Understanding somebody’s limitations should make my expectations more realistic, not make those limitations less consequential. “I understand how you became this way” can sit right next to “I now understand why I shouldn’t rely on you for this.”</w:t>
@@ -4990,16 +5112,16 @@
       <w:r>
         <w:t xml:space="preserve">Forgiving yourself works the same way. Own what you did (only what was yours), and let yourself feel the remorse. Repair what you can, by apologizing or making amends. </w:t>
       </w:r>
-      <w:commentRangeStart w:id="56"/>
+      <w:commentRangeStart w:id="63"/>
       <w:r>
         <w:rPr>
           <w:shd w:fill="E2ECF7" w:color="auto" w:val="clear"/>
         </w:rPr>
         <w:t xml:space="preserve">Changing the behavior counts too.</w:t>
       </w:r>
-      <w:commentRangeEnd w:id="56"/>
-      <w:r>
-        <w:commentReference w:id="56"/>
+      <w:commentRangeEnd w:id="63"/>
+      <w:r>
+        <w:commentReference w:id="63"/>
       </w:r>
       <w:r>
         <w:t xml:space="preserve"> Then you’re allowed to stop holding yourself hostage, and the responsibility stays. If you’re thinking “not me, not after what I did,” forgiving other people tends to be harder too. Every so often, come back to how whoever did it got to be someone who could do that, until you understand it well enough that it changes how you feel.</w:t>
@@ -5171,32 +5293,52 @@
         <w:spacing w:after="160"/>
       </w:pPr>
       <w:r>
-        <w:t xml:space="preserve">Be patient with yourself, and gentle, including with the part of you that thinks you should be over it by now. </w:t>
-      </w:r>
-      <w:r>
+        <w:t xml:space="preserve">Be patient with yourself, and gentle, including with the part of you that thinks you should be over it by now.</w:t>
+      </w:r>
+      <w:commentRangeStart w:id="65"/>
+      <w:r>
+        <w:rPr>
+          <w:shd w:fill="BDD7EE" w:color="auto" w:val="clear"/>
+        </w:rPr>
+        <w:t xml:space="preserve"> </w:t>
+      </w:r>
+      <w:r>
+        <w:rPr>
+          <w:shd w:fill="BDD7EE" w:color="auto" w:val="clear"/>
+        </w:rPr>
         <w:t xml:space="preserve">You are more than your pain and your past. </w:t>
       </w:r>
-      <w:commentRangeStart w:id="57"/>
-      <w:del w:id="38" w:author="Claude" w:date="2026-10-26T14:00:00Z">
+      <w:commentRangeStart w:id="64"/>
+      <w:del w:id="41" w:author="Claude" w:date="2026-10-26T14:00:00Z">
         <w:r>
           <w:delText xml:space="preserve">That’s easy to lose sight of when you’ve spent so long looking at them. </w:delText>
         </w:r>
       </w:del>
-      <w:del w:id="39" w:author="Claude" w:date="2026-10-26T14:00:00Z">
+      <w:del w:id="42" w:author="Claude" w:date="2026-10-26T14:00:00Z">
         <w:r>
           <w:delText xml:space="preserve">And you aren’t alone. </w:delText>
         </w:r>
       </w:del>
-      <w:commentRangeEnd w:id="57"/>
-      <w:r>
-        <w:commentReference w:id="57"/>
-      </w:r>
-      <w:r>
+      <w:commentRangeEnd w:id="64"/>
+      <w:r>
+        <w:commentReference w:id="64"/>
+      </w:r>
+      <w:r>
+        <w:rPr>
+          <w:shd w:fill="BDD7EE" w:color="auto" w:val="clear"/>
+        </w:rPr>
         <w:t xml:space="preserve">There’s help</w:t>
       </w:r>
       <w:r>
+        <w:rPr>
+          <w:shd w:fill="BDD7EE" w:color="auto" w:val="clear"/>
+        </w:rPr>
         <w:t xml:space="preserve">, and lots of other people are out there learning to look after their own little ones.</w:t>
       </w:r>
+      <w:commentRangeEnd w:id="65"/>
+      <w:r>
+        <w:commentReference w:id="65"/>
+      </w:r>
     </w:p>
     <w:p>
       <w:pPr>
@@ -5221,16 +5363,16 @@
       <w:r>
         <w:t xml:space="preserve">Of the clinical approaches I know, schema therapy is the closest to this guide. Its therapists do what they call limited reparenting: within professional limits, they give you some of what a good parent would, with warmth and firmness and some playfulness too. Over time you take that in, and it becomes your own “Healthy Adult,” who looks after your “Vulnerable Child” and stands up to the punishing parent in your head. </w:t>
       </w:r>
-      <w:commentRangeStart w:id="58"/>
+      <w:commentRangeStart w:id="66"/>
       <w:r>
         <w:rPr>
           <w:shd w:fill="E2ECF7" w:color="auto" w:val="clear"/>
         </w:rPr>
         <w:t xml:space="preserve">It sets limits, too.</w:t>
       </w:r>
-      <w:commentRangeEnd w:id="58"/>
-      <w:r>
-        <w:commentReference w:id="58"/>
+      <w:commentRangeEnd w:id="66"/>
+      <w:r>
+        <w:commentReference w:id="66"/>
       </w:r>
       <w:r>
         <w:t xml:space="preserve"> And it gets on with adult life, like work and the things you’ve committed to. </w:t>
@@ -5249,16 +5391,16 @@
       <w:pPr>
         <w:spacing w:after="160"/>
       </w:pPr>
-      <w:commentRangeStart w:id="59"/>
+      <w:commentRangeStart w:id="67"/>
       <w:r>
         <w:rPr>
           <w:shd w:fill="E2ECF7" w:color="auto" w:val="clear"/>
         </w:rPr>
         <w:t xml:space="preserve">Where it really differs is spirituality.</w:t>
       </w:r>
-      <w:commentRangeEnd w:id="59"/>
-      <w:r>
-        <w:commentReference w:id="59"/>
+      <w:commentRangeEnd w:id="67"/>
+      <w:r>
+        <w:commentReference w:id="67"/>
       </w:r>
       <w:r>
         <w:t xml:space="preserve"> Schema therapy doesn’t build it in, though the preface to its main textbook calls blending it with meditation or religious practice an important development. That’s not so surprising, since it grew out of cognitive therapy. Some people do blend them, though. Tara Bennett-Goleman’s book Emotional Alchemy, for one, fits a Buddhist loving-kindness wish to each schema. Her book barely mentions gratitude, and for me that’s the door to the bigger love back in Your Loan is PRE-APPROVED! IFS goes overboard the other way, in my opinion (more on that in the next section).</w:t>
@@ -5407,403 +5549,459 @@
   <w:comment w:id="2" w:author="Claude" w:date="2026-10-26T14:00:00.000Z">
     <w:p>
       <w:r>
-        <w:t xml:space="preserve">My pass: a cut, nothing added. Round 8 read: r8w005 Human, Medium (0.950) "The cushion was practice for it."; r8w004 Human, Medium (0.982) "Say your boss asks you to stay late again." stays. The tell: an aphoristic closer that sums up. It keeps that reparenting goes on in ordinary life, and the boss example; it drops the cushion's credit as practice for that moment. Its block is not checked yet.</w:t>
+        <w:t xml:space="preserve">My pass: a cut, nothing added. Round 8 read: r8w005 Human, Medium (0.950) "The cushion was practice for it."; r8w004 Human, Medium (0.982) "Say your boss asks you to stay late again." stays. The tell: an aphoristic closer that sums up. It keeps that reparenting goes on in ordinary life, and the boss example; it drops the cushion's credit as practice for that moment. Checked with its block after the change (https://www.pangram.com/history/8ebeb962-bf21-4080-b20b-2dec350e0561): Human Written, 0.00% AI. In this paragraph: Human, Medium (9 words) on "Say your boss asks you to stay late again.".</w:t>
       </w:r>
     </w:p>
   </w:comment>
   <w:comment w:id="3" w:author="Claude" w:date="2026-10-26T14:00:00.000Z">
     <w:p>
       <w:r>
+        <w:t xml:space="preserve">After my change, the check of this block alone (without the rest of the guide) read this Human, Medium confidence.</w:t>
+      </w:r>
+    </w:p>
+  </w:comment>
+  <w:comment w:id="4" w:author="Claude" w:date="2026-10-26T14:00:00.000Z">
+    <w:p>
+      <w:r>
         <w:t xml:space="preserve">Round 8: Human, Medium confidence (0.989). Round 6, same words: Human, Medium. Mine. I left it: nearly High (0.985 or more).</w:t>
       </w:r>
     </w:p>
   </w:comment>
-  <w:comment w:id="4" w:author="Claude" w:date="2026-10-26T14:00:00.000Z">
+  <w:comment w:id="5" w:author="Claude" w:date="2026-10-26T14:00:00.000Z">
     <w:p>
       <w:r>
         <w:t xml:space="preserve">Round 8: Human, Medium confidence (0.975). Round 6, same words: Human, Medium. Your published guide's line: left for you.</w:t>
       </w:r>
     </w:p>
   </w:comment>
-  <w:comment w:id="5" w:author="Claude" w:date="2026-10-26T14:00:00.000Z">
+  <w:comment w:id="6" w:author="Claude" w:date="2026-10-26T14:00:00.000Z">
     <w:p>
       <w:r>
         <w:t xml:space="preserve">Round 8: Human, Medium confidence (0.986). Round 6, same words: Human, High. Mine. I left it: nearly High (0.985 or more).</w:t>
       </w:r>
     </w:p>
   </w:comment>
-  <w:comment w:id="6" w:author="Claude" w:date="2026-10-26T14:00:00.000Z">
+  <w:comment w:id="7" w:author="Claude" w:date="2026-10-26T14:00:00.000Z">
     <w:p>
       <w:r>
         <w:t xml:space="preserve">Round 8: Human, Medium confidence (0.976). Round 6, same words: Human, Low. Mine. I found no tell I could take out here without losing something; I left it.</w:t>
       </w:r>
     </w:p>
   </w:comment>
-  <w:comment w:id="7" w:author="Claude" w:date="2026-10-26T14:00:00.000Z">
+  <w:comment w:id="8" w:author="Claude" w:date="2026-10-26T14:00:00.000Z">
     <w:p>
       <w:r>
         <w:t xml:space="preserve">Round 8: Human, Medium confidence (0.989). Round 6, same words: these words weren't there in round 6. Mine. I left it: nearly High (0.985 or more).</w:t>
       </w:r>
     </w:p>
   </w:comment>
-  <w:comment w:id="8" w:author="Claude" w:date="2026-10-26T14:00:00.000Z">
-    <w:p>
-      <w:r>
-        <w:t xml:space="preserve">My pass: a cut, nothing added. Round 8 read: r8w013 Human, Medium (0.986) "That doesn't close the door, though, it just means you start smaller.". The tell: "not X, it just Y" (it doesn't close the door, it just means). It keeps feeling none of the warmth means starting smaller, a way in that stays open; it drops the words "doesn't close the door", which "you start" still says. Its block is not checked yet.</w:t>
-      </w:r>
-    </w:p>
-  </w:comment>
   <w:comment w:id="9" w:author="Claude" w:date="2026-10-26T14:00:00.000Z">
     <w:p>
       <w:r>
-        <w:t xml:space="preserve">My pass: its point said plainly. Round 8 read: r8w015 Human, Medium (0.981) "Maybe you're more worn out now, or missing whatever helped back then. (No example? Try another doorway.)". The tell: a question answered with a short knock-down, in parentheses. It keeps the pointer to the other doorways for a reader with no example; "Maybe you're more worn out now ..." stays, the grounding's point that past strength doesn't cancel today's limits; it drops nothing. Its block is not checked yet.</w:t>
+        <w:t xml:space="preserve">My pass: a cut, nothing added. Round 8 read: r8w013 Human, Medium (0.986) "That doesn't close the door, though, it just means you start smaller.". The tell: "not X, it just Y" (it doesn't close the door, it just means). It keeps feeling none of the warmth means starting smaller, a way in that stays open; it drops the words "doesn't close the door", which "you start" still says. Its block's check ended without an answer: the request timed out, so it may or may not have reached Pangram, and it isn't sent again until the account's History shows which (the next whole-guide check reads it in any case).</w:t>
       </w:r>
     </w:p>
   </w:comment>
   <w:comment w:id="10" w:author="Claude" w:date="2026-10-26T14:00:00.000Z">
     <w:p>
       <w:r>
-        <w:t xml:space="preserve">My pass: a cut, nothing added. Round 8 read: r8w016 Human, Medium (0.943) "I hate myself." If that's what you find, it deserves an honest hearing. Just listen to it, without arguing back.". The tell: a stock phrase ("deserves an honest hearing") and a follow-up that restates it. It keeps listening to the "I hate myself" part without arguing back, which is what an honest hearing is; it drops nothing. Its block is not checked yet.</w:t>
+        <w:t xml:space="preserve">My pass: its point said plainly. Round 8 read: r8w015 Human, Medium (0.981) "Maybe you're more worn out now, or missing whatever helped back then. (No example? Try another doorway.)". The tell: a question answered with a short knock-down, in parentheses. It keeps the pointer to the other doorways for a reader with no example; "Maybe you're more worn out now ..." stays, the grounding's point that past strength doesn't cancel today's limits; it drops nothing. Checked with its block after the change (https://www.pangram.com/history/33231c23-2cb5-4f24-93bc-8023153ce108): Human Written, 0.00% AI. In this paragraph: Human, Medium (9 words) on "(If no example comes to mind, try another doorway.)".</w:t>
       </w:r>
     </w:p>
   </w:comment>
   <w:comment w:id="11" w:author="Claude" w:date="2026-10-26T14:00:00.000Z">
     <w:p>
       <w:r>
-        <w:t xml:space="preserve">My pass: a cut, nothing added. Round 8 read: r8w019 Human, Medium (0.974) "You don't need to decide which.". The tell: a reassuring permission ("You don't need to ...") between the list and the step. It keeps the list of what brought you here, and asking that part what it hoped for, which needs no decision first; it drops the explicit permission. Its block is not checked yet.</w:t>
+        <w:t xml:space="preserve">After my change, the check of this block alone (without the rest of the guide) read this Human, Medium confidence.</w:t>
       </w:r>
     </w:p>
   </w:comment>
   <w:comment w:id="12" w:author="Claude" w:date="2026-10-26T14:00:00.000Z">
     <w:p>
       <w:r>
-        <w:t xml:space="preserve">My pass: a cut, nothing added. Round 8 read: r8w021 Human, Low (0.829) "And if nothing moves at all, don't push it."; r8w020 Human, Medium (0.980) "Watch how it lands, though." stays. The tell: a short tidy instruction between the image and the reassurance, the shape image, advice, comfort. It keeps the aunt and the uncle (the one who just sits there is the one the child climbs on: no pushing), and "Knowing that love is in you somewhere counts for a lot", which is what counts when nothing moves; it drops the words "don't push it", which the aunt and the uncle already show. Its block is not checked yet.</w:t>
+        <w:t xml:space="preserve">My pass: a cut, nothing added. Round 8 read: r8w016 Human, Medium (0.943) "I hate myself." If that's what you find, it deserves an honest hearing. Just listen to it, without arguing back.". The tell: a stock phrase ("deserves an honest hearing") and a follow-up that restates it. It keeps listening to the "I hate myself" part without arguing back, which is what an honest hearing is; it drops nothing. Checked with its block after the change (https://www.pangram.com/history/cfd5e3ca-91b3-4382-88be-85c6fb594c52): Human Written, 0.00% AI. In this paragraph: every window over it Human, High.</w:t>
       </w:r>
     </w:p>
   </w:comment>
   <w:comment w:id="13" w:author="Claude" w:date="2026-10-26T14:00:00.000Z">
     <w:p>
       <w:r>
-        <w:t xml:space="preserve">My pass: its point said plainly. Round 8 read: r8w022 AI, Low (0.668), its first two sentences; r8w023 Human, Medium (0.933), "That's how you learn as a kid, and it works now, too.". The tell: an instruction wrapped in an image ("hand it to yourself"), filler ("then for now just try"), the example packaged as "If the advice was ..." and a reassuring follow-up ("and it works now, too"). It keeps the step (one small piece of the advice you'd give them, done yourself), the sleep example with its numbers, and scaffolding with its link; it drops "That's how you learn as a kid, and it works now, too." The scaffolding link says what it said: small steps are how people learn.. Its block is not checked yet.</w:t>
+        <w:t xml:space="preserve">My pass: a cut, nothing added. Round 8 read: r8w019 Human, Medium (0.974) "You don't need to decide which.". The tell: a reassuring permission ("You don't need to ...") between the list and the step. It keeps the list of what brought you here, and asking that part what it hoped for, which needs no decision first; it drops the explicit permission. Checked with its block after the change (https://www.pangram.com/history/cfd5e3ca-91b3-4382-88be-85c6fb594c52): Human Written, 0.00% AI. In this paragraph: Human, Medium (3 words) on "What was it?".</w:t>
       </w:r>
     </w:p>
   </w:comment>
   <w:comment w:id="14" w:author="Claude" w:date="2026-10-26T14:00:00.000Z">
     <w:p>
       <w:r>
+        <w:t xml:space="preserve">After my change, the check of this block alone (without the rest of the guide) read this Human, Medium confidence.</w:t>
+      </w:r>
+    </w:p>
+  </w:comment>
+  <w:comment w:id="15" w:author="Claude" w:date="2026-10-26T14:00:00.000Z">
+    <w:p>
+      <w:r>
+        <w:t xml:space="preserve">My pass: a cut, nothing added. Round 8 read: r8w021 Human, Low (0.829) "And if nothing moves at all, don't push it."; r8w020 Human, Medium (0.980) "Watch how it lands, though." stays. The tell: a short tidy instruction between the image and the reassurance, the shape image, advice, comfort. It keeps the aunt and the uncle (the one who just sits there is the one the child climbs on: no pushing), and "Knowing that love is in you somewhere counts for a lot", which is what counts when nothing moves; it drops the words "don't push it", which the aunt and the uncle already show. Checked with its block after the change (https://www.pangram.com/history/51d04a39-9289-47e5-a581-7853cffc332d): Human Written, 0.00% AI. In this paragraph: every window over it Human, High.</w:t>
+      </w:r>
+    </w:p>
+  </w:comment>
+  <w:comment w:id="16" w:author="Claude" w:date="2026-10-26T14:00:00.000Z">
+    <w:p>
+      <w:r>
+        <w:t xml:space="preserve">My pass: its point said plainly. Round 8 read: r8w022 AI, Low (0.668), its first two sentences; r8w023 Human, Medium (0.933), "That's how you learn as a kid, and it works now, too.". The tell: an instruction wrapped in an image ("hand it to yourself"), filler ("then for now just try"), the example packaged as "If the advice was ..." and a reassuring follow-up ("and it works now, too"). It keeps the step (one small piece of the advice you'd give them, done yourself), the sleep example with its numbers, and scaffolding with its link; it drops "That's how you learn as a kid, and it works now, too." The scaffolding link says what it said: small steps are how people learn.. Checked with its block after the change (https://www.pangram.com/history/51d04a39-9289-47e5-a581-7853cffc332d): Human Written, 0.00% AI. In this paragraph: every window over it Human, High.</w:t>
+      </w:r>
+    </w:p>
+  </w:comment>
+  <w:comment w:id="17" w:author="Claude" w:date="2026-10-26T14:00:00.000Z">
+    <w:p>
+      <w:r>
         <w:t xml:space="preserve">Round 8: Human, Medium confidence (0.989). Round 6, same words: Human, High. Mine. I left it: nearly High (0.985 or more).</w:t>
       </w:r>
     </w:p>
   </w:comment>
-  <w:comment w:id="15" w:author="Claude" w:date="2026-10-26T14:00:00.000Z">
+  <w:comment w:id="18" w:author="Claude" w:date="2026-10-26T14:00:00.000Z">
     <w:p>
       <w:r>
         <w:t xml:space="preserve">Round 8: Human, Medium confidence (0.989). Round 6, same words: Human, Low. Mine. I left it: nearly High (0.985 or more).</w:t>
       </w:r>
     </w:p>
   </w:comment>
-  <w:comment w:id="16" w:author="Claude" w:date="2026-10-26T14:00:00.000Z">
+  <w:comment w:id="19" w:author="Claude" w:date="2026-10-26T14:00:00.000Z">
     <w:p>
       <w:r>
         <w:t xml:space="preserve">Round 8: Human, Medium confidence (0.983). Round 6, same words: Human, Medium. Mine. I found no tell I could take out here without losing something; I left it.</w:t>
       </w:r>
     </w:p>
   </w:comment>
-  <w:comment w:id="17" w:author="Claude" w:date="2026-10-26T14:00:00.000Z">
+  <w:comment w:id="20" w:author="Claude" w:date="2026-10-26T14:00:00.000Z">
     <w:p>
       <w:r>
         <w:t xml:space="preserve">Round 8: Human, Medium confidence (0.989). Round 6, same words: Human, High. Partly your words (your quoted "Tell me what feels unsafe."); the rest is mine, nearly High: I left it.</w:t>
       </w:r>
     </w:p>
   </w:comment>
-  <w:comment w:id="18" w:author="Claude" w:date="2026-10-26T14:00:00.000Z">
-    <w:p>
-      <w:r>
-        <w:t xml:space="preserve">My pass: a cut, nothing added. Round 8 read: r8w030 Human, Low (0.503), its second and third sentences; r8w031 Human, Low (0.848) "The complaint might only be one sentence, once the swearing runs out.". The tell: a short balanced instruction ("If it's something serious, answer it seriously.") and a tidy prediction that the next sentence explains anyway. It keeps listening for the concrete complaint without fighting the swearing, and why the swearing stops; answering what's serious is said by P5 ("take whatever's true in the anger seriously") and shown by Mr. Rogers in the next paragraph ("he does answer what's worth answering in it"); it drops the hedged prediction that the complaint might only be one sentence, which nothing relies on (the three reviewers' note: the record first said nothing was lost). Its block is not checked yet.</w:t>
-      </w:r>
-    </w:p>
-  </w:comment>
-  <w:comment w:id="19" w:author="Claude" w:date="2026-10-26T14:00:00.000Z">
+  <w:comment w:id="21" w:author="Claude" w:date="2026-10-26T14:00:00.000Z">
+    <w:p>
+      <w:r>
+        <w:t xml:space="preserve">My pass: a cut, nothing added. Round 8 read: r8w030 Human, Low (0.503), its second and third sentences; r8w031 Human, Low (0.848) "The complaint might only be one sentence, once the swearing runs out.". The tell: a short balanced instruction ("If it's something serious, answer it seriously."), a tidy prediction that the next sentence explains anyway, and (try 2, after try 1's check read it Low) the permission packaging "You don't have to accept every conclusion they reach about you, but do ...". It keeps listening for the concrete complaint without fighting the swearing, and why the swearing stops; answering what's serious is said by P5 ("take whatever's true in the anger seriously") and shown by Mr. Rogers in the next paragraph ("he does answer what's worth answering in it"), and not accepting every conclusion is shown there too ("He doesn't collapse under that or fight it"); it drops the hedged prediction that the complaint might only be one sentence, which nothing relies on, and the explicit permission not to accept every conclusion, which the Mr. Rogers paragraph shows. Checked with its block after the change (https://www.pangram.com/history/b695880a-a675-4047-8b89-5f0b92d39fee): Mostly Human Written, 2.44% AI. In this paragraph: Human, Medium (40 words) on "Listen for the concrete complaint without fighting the yelling and swearing around it. Lik".</w:t>
+      </w:r>
+    </w:p>
+  </w:comment>
+  <w:comment w:id="22" w:author="Claude" w:date="2026-10-26T14:00:00.000Z">
+    <w:p>
+      <w:r>
+        <w:t xml:space="preserve">After my change, the check of this block alone (without the rest of the guide) read this Human, Medium confidence.</w:t>
+      </w:r>
+    </w:p>
+  </w:comment>
+  <w:comment w:id="23" w:author="Claude" w:date="2026-10-26T14:00:00.000Z">
+    <w:p>
+      <w:r>
+        <w:t xml:space="preserve">Not in round 8's list: the whole guide read this sentence Human, High. But the check of its block after my change to the paragraph with "Your little one might say it's you" read it AI, Low (https://www.pangram.com/history/b695880a-a675-4047-8b89-5f0b92d39fee), and Human, Low before that change (https://www.pangram.com/history/1635c866-8fde-4e37-8572-b757f49bc675). Mine. The tell I see: a cautionary closer ("Be careful not to ..., when it could just be ..."). I left it for the next whole-guide check, which reads it in place.</w:t>
+      </w:r>
+    </w:p>
+  </w:comment>
+  <w:comment w:id="24" w:author="Claude" w:date="2026-10-26T14:00:00.000Z">
     <w:p>
       <w:r>
         <w:t xml:space="preserve">Round 8: Human, Medium confidence (0.971). Round 6, same words: Human, Medium. Your words: left for you.</w:t>
       </w:r>
     </w:p>
   </w:comment>
-  <w:comment w:id="20" w:author="Claude" w:date="2026-10-26T14:00:00.000Z">
+  <w:comment w:id="25" w:author="Claude" w:date="2026-10-26T14:00:00.000Z">
     <w:p>
       <w:r>
         <w:t xml:space="preserve">Round 8: Human, Medium confidence (0.909). Round 6, same words: Human, Low. Your words: left for you. The tell I see, if any: a topic sentence that announces the paragraph.</w:t>
       </w:r>
     </w:p>
   </w:comment>
-  <w:comment w:id="21" w:author="Claude" w:date="2026-10-26T14:00:00.000Z">
+  <w:comment w:id="26" w:author="Claude" w:date="2026-10-26T14:00:00.000Z">
     <w:p>
       <w:r>
         <w:t xml:space="preserve">Round 8: Human, Medium confidence (0.989). Round 6, same words: Human, High. Mine. I left it: nearly High (0.985 or more).</w:t>
       </w:r>
     </w:p>
   </w:comment>
-  <w:comment w:id="22" w:author="Claude" w:date="2026-10-26T14:00:00.000Z">
+  <w:comment w:id="27" w:author="Claude" w:date="2026-10-26T14:00:00.000Z">
     <w:p>
       <w:r>
         <w:t xml:space="preserve">Round 8: Human, Medium confidence (0.989). Round 6, same words: Human, High. Mine. I left it: nearly High (0.985 or more).</w:t>
       </w:r>
     </w:p>
   </w:comment>
-  <w:comment w:id="23" w:author="Claude" w:date="2026-10-26T14:00:00.000Z">
+  <w:comment w:id="28" w:author="Claude" w:date="2026-10-26T14:00:00.000Z">
     <w:p>
       <w:r>
         <w:t xml:space="preserve">Round 8: Human, Medium confidence (0.986). Round 6, same words: Human, Medium. Mine. I left it: nearly High (0.985 or more).</w:t>
       </w:r>
     </w:p>
   </w:comment>
-  <w:comment w:id="24" w:author="Claude" w:date="2026-10-26T14:00:00.000Z">
+  <w:comment w:id="29" w:author="Claude" w:date="2026-10-26T14:00:00.000Z">
     <w:p>
       <w:r>
         <w:t xml:space="preserve">Round 8: Human, Medium confidence (0.983). Round 6, same words: Human, Medium. Mine. I found no tell I could take out here without losing something; I left it.</w:t>
       </w:r>
     </w:p>
   </w:comment>
-  <w:comment w:id="25" w:author="Claude" w:date="2026-10-26T14:00:00.000Z">
+  <w:comment w:id="30" w:author="Claude" w:date="2026-10-26T14:00:00.000Z">
     <w:p>
       <w:r>
         <w:t xml:space="preserve">Round 8: Human, Medium confidence (0.989). Round 6, same words: Human, Medium. Mine. I left it: nearly High (0.985 or more).</w:t>
       </w:r>
     </w:p>
   </w:comment>
-  <w:comment w:id="26" w:author="Claude" w:date="2026-10-26T14:00:00.000Z">
+  <w:comment w:id="31" w:author="Claude" w:date="2026-10-26T14:00:00.000Z">
     <w:p>
       <w:r>
         <w:t xml:space="preserve">Round 8: Human, Medium confidence (0.987). Round 6, same words: Human, High. Your words: left for you.</w:t>
       </w:r>
     </w:p>
   </w:comment>
-  <w:comment w:id="27" w:author="Claude" w:date="2026-10-26T14:00:00.000Z">
+  <w:comment w:id="32" w:author="Claude" w:date="2026-10-26T14:00:00.000Z">
     <w:p>
       <w:r>
         <w:t xml:space="preserve">Round 8: Human, Medium confidence (0.989). Round 6, same words: Human, High. Mine. I left it: nearly High (0.985 or more).</w:t>
       </w:r>
     </w:p>
   </w:comment>
-  <w:comment w:id="28" w:author="Claude" w:date="2026-10-26T14:00:00.000Z">
+  <w:comment w:id="33" w:author="Claude" w:date="2026-10-26T14:00:00.000Z">
     <w:p>
       <w:r>
         <w:t xml:space="preserve">Round 8: Human, Medium confidence (0.988). Round 6, same words: Human, Medium. Your words: left for you.</w:t>
       </w:r>
     </w:p>
   </w:comment>
-  <w:comment w:id="29" w:author="Claude" w:date="2026-10-26T14:00:00.000Z">
+  <w:comment w:id="34" w:author="Claude" w:date="2026-10-26T14:00:00.000Z">
     <w:p>
       <w:r>
         <w:t xml:space="preserve">Round 8: Human, Medium confidence (0.987). Round 6, same words: Human, Medium (the lowest of 2 windows over these words). Your words: left for you.</w:t>
       </w:r>
     </w:p>
   </w:comment>
-  <w:comment w:id="30" w:author="Claude" w:date="2026-10-26T14:00:00.000Z">
+  <w:comment w:id="35" w:author="Claude" w:date="2026-10-26T14:00:00.000Z">
     <w:p>
       <w:r>
         <w:t xml:space="preserve">Round 8: Human, Medium confidence (0.988). Round 6, same words: these words weren't there in round 6. Partly your words (the Nurturer voice is yours): left for you.</w:t>
       </w:r>
     </w:p>
   </w:comment>
-  <w:comment w:id="31" w:author="Claude" w:date="2026-10-26T14:00:00.000Z">
+  <w:comment w:id="36" w:author="Claude" w:date="2026-10-26T14:00:00.000Z">
     <w:p>
       <w:r>
         <w:t xml:space="preserve">Round 8: Human, Medium confidence (0.977). Round 6, same words: Human, Medium (the lowest of 3 windows over these words). Your words: left for you.</w:t>
       </w:r>
     </w:p>
   </w:comment>
-  <w:comment w:id="32" w:author="Claude" w:date="2026-10-26T14:00:00.000Z">
-    <w:p>
-      <w:r>
-        <w:t xml:space="preserve">My pass: its point said plainly. Round 8 read: r8w048 Human, Low (0.503) "Can't tell if that's you?"; r8w049 to r8w051 AI, Low (0.503 to 0.595), its last three sentences. The tell: a question answered with a short knock-down ("Can't tell if that's you? Treat it like it is."), and a disclaimer followed by a reframe ("None of that is me answering ... It just keeps ..."), the not-X, it-just-Y shape. It keeps every safety instruction and its order; the grounding's MUSTs (a crisis line counts; if you can't tell whether it's you, do the same, as if it is); his guide's two points, that this isn't an answer to whether life is worth living and that it keeps the question open long enough to look at; it drops nothing; "That isn't my answer" is now said by "keeps the question ... open". Its block is not checked yet.</w:t>
-      </w:r>
-    </w:p>
-  </w:comment>
-  <w:comment w:id="33" w:author="Claude" w:date="2026-10-26T14:00:00.000Z">
+  <w:comment w:id="37" w:author="Claude" w:date="2026-10-26T14:00:00.000Z">
+    <w:p>
+      <w:r>
+        <w:t xml:space="preserve">My pass: its point said plainly. Round 8 read: r8w048 Human, Low (0.503) "Can't tell if that's you?"; r8w049 to r8w051 AI, Low (0.503 to 0.595), its last three sentences. The tell: a question answered with a short knock-down ("Can't tell if that's you? Treat it like it is."), and a disclaimer followed by a reframe ("None of that is me answering ... It just keeps ..."), the not-X, it-just-Y shape. It keeps every safety instruction and its order; the grounding's MUSTs (a crisis line counts; if you can't tell whether it's you, do the same, as if it is); his guide's two points, that this isn't an answer to whether life is worth living and that it keeps the question open long enough to look at; it drops nothing; "That isn't my answer" is now said by "keeps the question ... open". Checked with its block after the change (https://www.pangram.com/history/25417671-a332-4fea-9f90-64719e1634a8): Human Written, 0.00% AI. In this paragraph: Human, Medium (18 words) on "Getting safe first keeps the question of whether life is worth living open long enough to ".</w:t>
+      </w:r>
+    </w:p>
+  </w:comment>
+  <w:comment w:id="38" w:author="Claude" w:date="2026-10-26T14:00:00.000Z">
+    <w:p>
+      <w:r>
+        <w:t xml:space="preserve">After my change, the check of this block alone (without the rest of the guide) read this Human, Medium confidence.</w:t>
+      </w:r>
+    </w:p>
+  </w:comment>
+  <w:comment w:id="39" w:author="Claude" w:date="2026-10-26T14:00:00.000Z">
     <w:p>
       <w:r>
         <w:t xml:space="preserve">Round 8: Human, Low confidence (0.805). Round 6, same words: Human, Low (the lowest of 2 windows over these words). Your words: left for you. The tell I see: a question answered right away ("And if none of them shows up yet? No problem, ..."), the shape round 8 read AI in the paragraph before it; said as one plain sentence in your words, it may read High.</w:t>
       </w:r>
     </w:p>
   </w:comment>
-  <w:comment w:id="34" w:author="Claude" w:date="2026-10-26T14:00:00.000Z">
+  <w:comment w:id="40" w:author="Claude" w:date="2026-10-26T14:00:00.000Z">
     <w:p>
       <w:r>
         <w:t xml:space="preserve">Round 8: Human, Medium confidence (0.988). Round 6, same words: Human, Medium. Your words: left for you.</w:t>
       </w:r>
     </w:p>
   </w:comment>
-  <w:comment w:id="35" w:author="Claude" w:date="2026-10-26T14:00:00.000Z">
+  <w:comment w:id="41" w:author="Claude" w:date="2026-10-26T14:00:00.000Z">
     <w:p>
       <w:r>
         <w:t xml:space="preserve">Round 8: Human, Medium confidence (0.951). Round 6, same words: Human, Medium. Mine. I found no tell I could take out here without losing something; I left it.</w:t>
       </w:r>
     </w:p>
   </w:comment>
-  <w:comment w:id="36" w:author="Claude" w:date="2026-10-26T14:00:00.000Z">
+  <w:comment w:id="42" w:author="Claude" w:date="2026-10-26T14:00:00.000Z">
     <w:p>
       <w:r>
         <w:t xml:space="preserve">Round 8: Human, Medium confidence (0.980). Round 6, same words: these words weren't there in round 6. Your approved version of this section (GPT's dedup, word for word, turn 53): left for you. A short general line between two sets of examples; it may be fine.</w:t>
       </w:r>
     </w:p>
   </w:comment>
-  <w:comment w:id="37" w:author="Claude" w:date="2026-10-26T14:00:00.000Z">
+  <w:comment w:id="43" w:author="Claude" w:date="2026-10-26T14:00:00.000Z">
     <w:p>
       <w:r>
         <w:t xml:space="preserve">Round 8: Human, Medium confidence (0.987). Round 6, same words: Human, Medium. Your approved version of this section (GPT's dedup, word for word, turn 53): left for you.</w:t>
       </w:r>
     </w:p>
   </w:comment>
-  <w:comment w:id="38" w:author="Claude" w:date="2026-10-26T14:00:00.000Z">
+  <w:comment w:id="44" w:author="Claude" w:date="2026-10-26T14:00:00.000Z">
     <w:p>
       <w:r>
         <w:t xml:space="preserve">Round 8: Human, Medium confidence (0.961). Round 6, same words: Human, Medium. Your approved version of this section (GPT's dedup, word for word, turn 53): left for you. The tell I see: "You don't have to ..." permission, then "The question is whether ...".</w:t>
       </w:r>
     </w:p>
   </w:comment>
-  <w:comment w:id="39" w:author="Claude" w:date="2026-10-26T14:00:00.000Z">
+  <w:comment w:id="45" w:author="Claude" w:date="2026-10-26T14:00:00.000Z">
     <w:p>
       <w:r>
         <w:t xml:space="preserve">Round 8: Human, Medium confidence (0.983). Round 6, same words: Human, Medium. Mine. I found no tell I could take out here without losing something; I left it.</w:t>
       </w:r>
     </w:p>
   </w:comment>
-  <w:comment w:id="40" w:author="Claude" w:date="2026-10-26T14:00:00.000Z">
+  <w:comment w:id="46" w:author="Claude" w:date="2026-10-26T14:00:00.000Z">
     <w:p>
       <w:r>
         <w:t xml:space="preserve">Round 8: Human, Medium confidence (0.989). Round 6, same words: Human, High. Your words: left for you.</w:t>
       </w:r>
     </w:p>
   </w:comment>
-  <w:comment w:id="41" w:author="Claude" w:date="2026-10-26T14:00:00.000Z">
+  <w:comment w:id="47" w:author="Claude" w:date="2026-10-26T14:00:00.000Z">
     <w:p>
       <w:r>
         <w:t xml:space="preserve">Round 8: Human, Medium confidence (0.986). Round 6, same words: Human, Medium. Mine. I left it: nearly High (0.985 or more).</w:t>
       </w:r>
     </w:p>
   </w:comment>
-  <w:comment w:id="42" w:author="Claude" w:date="2026-10-26T14:00:00.000Z">
+  <w:comment w:id="48" w:author="Claude" w:date="2026-10-26T14:00:00.000Z">
     <w:p>
       <w:r>
         <w:t xml:space="preserve">Round 8: Human, Medium confidence (0.986). Round 6, same words: Human, Medium. Mine. I left it: nearly High (0.985 or more).</w:t>
       </w:r>
     </w:p>
   </w:comment>
-  <w:comment w:id="43" w:author="Claude" w:date="2026-10-26T14:00:00.000Z">
+  <w:comment w:id="49" w:author="Claude" w:date="2026-10-26T14:00:00.000Z">
     <w:p>
       <w:r>
         <w:t xml:space="preserve">Round 8: Human, Medium confidence (0.979). Round 6, same words: Human, Medium. Your words: left for you.</w:t>
       </w:r>
     </w:p>
   </w:comment>
-  <w:comment w:id="44" w:author="Claude" w:date="2026-10-26T14:00:00.000Z">
+  <w:comment w:id="50" w:author="Claude" w:date="2026-10-26T14:00:00.000Z">
     <w:p>
       <w:r>
         <w:t xml:space="preserve">Round 8: Human, Medium confidence (0.975). Round 6, same words: Human, Medium. Mine, in a paragraph you approved as it is (your yes to C2): see the suggestion on these words.</w:t>
       </w:r>
     </w:p>
   </w:comment>
-  <w:comment w:id="45" w:author="Claude" w:date="2026-10-26T14:00:00.000Z">
+  <w:comment w:id="51" w:author="Claude" w:date="2026-10-26T14:00:00.000Z">
     <w:p>
       <w:r>
         <w:t xml:space="preserve">Round 8: Human, Medium confidence (0.955). Round 6, same words: Human, Medium. Mine, in a paragraph you approved as it is; it holds the danger line, which stays.</w:t>
       </w:r>
     </w:p>
   </w:comment>
-  <w:comment w:id="46" w:author="Claude" w:date="2026-10-26T14:00:00.000Z">
+  <w:comment w:id="52" w:author="Claude" w:date="2026-10-26T14:00:00.000Z">
     <w:p>
       <w:r>
         <w:t xml:space="preserve">A suggestion only, since you approved this paragraph as it is. Round 8 read: r8w066 Human, Medium (0.975) "And reaching out doesn't mean telling strangers everything. Privacy isn't fakery."; r8w067 Human, Medium (0.955) stays (the danger line is a safety line). The tell: an aphorism that sums up ("Privacy isn't fakery."). The cut: "Privacy isn’t fakery." (nothing added). It keeps that you don't tell strangers everything, and the contrast with keeping up a fake version of yourself, which the paragraph makes later in its own words.</w:t>
       </w:r>
     </w:p>
   </w:comment>
-  <w:comment w:id="47" w:author="Claude" w:date="2026-10-26T14:00:00.000Z">
+  <w:comment w:id="53" w:author="Claude" w:date="2026-10-26T14:00:00.000Z">
     <w:p>
       <w:r>
         <w:t xml:space="preserve">Round 8: Human, Medium confidence (0.961). Round 6, same words: Human, Low. Your words: left for you.</w:t>
       </w:r>
     </w:p>
   </w:comment>
-  <w:comment w:id="48" w:author="Claude" w:date="2026-10-26T14:00:00.000Z">
+  <w:comment w:id="54" w:author="Claude" w:date="2026-10-26T14:00:00.000Z">
     <w:p>
       <w:r>
         <w:t xml:space="preserve">Round 8: Human, Medium confidence (0.989). Round 6, same words: Human, Medium. Your words: left for you.</w:t>
       </w:r>
     </w:p>
   </w:comment>
-  <w:comment w:id="49" w:author="Claude" w:date="2026-10-26T14:00:00.000Z">
+  <w:comment w:id="55" w:author="Claude" w:date="2026-10-26T14:00:00.000Z">
     <w:p>
       <w:r>
         <w:t xml:space="preserve">Round 8: Human, Medium confidence (0.983). Round 6, same words: Human, High. Your words: left for you.</w:t>
       </w:r>
     </w:p>
   </w:comment>
-  <w:comment w:id="50" w:author="Claude" w:date="2026-10-26T14:00:00.000Z">
-    <w:p>
-      <w:r>
-        <w:t xml:space="preserve">My pass: its point said plainly. Round 8 read: r8w076 Human, Low (0.868) "What felt scared when I wrote it can read like a threat from over there.". The tell: a balanced inversion closer (felt scared here, reads like a threat over there). It keeps the reason to read it as them: what was fear when you wrote it can land as a threat; it drops nothing. Its block is not checked yet.</w:t>
-      </w:r>
-    </w:p>
-  </w:comment>
-  <w:comment w:id="51" w:author="Claude" w:date="2026-10-26T14:00:00.000Z">
+  <w:comment w:id="56" w:author="Claude" w:date="2026-10-26T14:00:00.000Z">
+    <w:p>
+      <w:r>
+        <w:t xml:space="preserve">My pass: its point said plainly. Round 8 read: r8w076 Human, Low (0.868) "What felt scared when I wrote it can read like a threat from over there.". The tell: a balanced inversion closer (felt scared here, reads like a threat over there). It keeps the reason to read it as them: what was fear when you wrote it can land as a threat; it drops nothing. Checked with its block after the change (https://www.pangram.com/history/7dce7368-9d9a-4c19-82ef-afe877a45b84): Human Written, 0.00% AI. In this paragraph: every window over it Human, High.</w:t>
+      </w:r>
+    </w:p>
+  </w:comment>
+  <w:comment w:id="57" w:author="Claude" w:date="2026-10-26T14:00:00.000Z">
     <w:p>
       <w:r>
         <w:t xml:space="preserve">Round 8: Human, Medium confidence (0.982). Round 6, same words: Human, Medium. Your words: left for you. (Hearthwork's premise, in your words.)</w:t>
       </w:r>
     </w:p>
   </w:comment>
-  <w:comment w:id="52" w:author="Claude" w:date="2026-10-26T14:00:00.000Z">
+  <w:comment w:id="58" w:author="Claude" w:date="2026-10-26T14:00:00.000Z">
     <w:p>
       <w:r>
         <w:t xml:space="preserve">Round 8: Human, Medium confidence (0.982). Round 6, same words: Human, Medium. Your words: left for you.</w:t>
       </w:r>
     </w:p>
   </w:comment>
-  <w:comment w:id="53" w:author="Claude" w:date="2026-10-26T14:00:00.000Z">
+  <w:comment w:id="59" w:author="Claude" w:date="2026-10-26T14:00:00.000Z">
     <w:p>
       <w:r>
         <w:t xml:space="preserve">Round 8: Human, Medium confidence (0.987). Round 6, same words: Human, High. Mine. I left it: nearly High (0.985 or more).</w:t>
       </w:r>
     </w:p>
   </w:comment>
-  <w:comment w:id="54" w:author="Claude" w:date="2026-10-26T14:00:00.000Z">
-    <w:p>
-      <w:r>
-        <w:t xml:space="preserve">My pass: its point said plainly. Round 8 read: r8w082 Human, Low (0.855) "Seeing how they got there doesn't make it okay."; r8w081 Human, Medium (0.961), its first sentence; r8w083 Human, Medium (0.984) stays. The tell: a short knock-down sentence after a balanced "still ... still" sentence. It keeps accountability, the hurt, and that understanding how they got there doesn't excuse it, said about the people in one sentence; it drops nothing. Its block is not checked yet.</w:t>
-      </w:r>
-    </w:p>
-  </w:comment>
-  <w:comment w:id="55" w:author="Claude" w:date="2026-10-26T14:00:00.000Z">
+  <w:comment w:id="60" w:author="Claude" w:date="2026-10-26T14:00:00.000Z">
+    <w:p>
+      <w:r>
+        <w:t xml:space="preserve">My pass: its point said plainly. Round 8 read: r8w082 Human, Low (0.855) "Seeing how they got there doesn't make it okay."; r8w081 Human, Medium (0.961), its first sentence; r8w083 Human, Medium (0.984) stays. The tell: a short knock-down sentence after a balanced "still ... still" sentence. It keeps accountability, the hurt, and that understanding how they got there doesn't excuse it, said about the people in one sentence; it drops nothing. Checked with its block after the change (https://www.pangram.com/history/edbd62c5-6b07-4b8e-9b51-41cffff43818): Human Written, 0.00% AI. In this paragraph: Human, Medium (3 words) on "Or the skills.".</w:t>
+      </w:r>
+    </w:p>
+  </w:comment>
+  <w:comment w:id="61" w:author="Claude" w:date="2026-10-26T14:00:00.000Z">
+    <w:p>
+      <w:r>
+        <w:t xml:space="preserve">After my change, the check of this block alone (without the rest of the guide) read this Human, Medium confidence.</w:t>
+      </w:r>
+    </w:p>
+  </w:comment>
+  <w:comment w:id="62" w:author="Claude" w:date="2026-10-26T14:00:00.000Z">
     <w:p>
       <w:r>
         <w:t xml:space="preserve">Round 8: Human, Medium confidence (0.970). Round 6, same words: Human, Medium. Mine. I found no tell I could take out here without losing something; I left it.</w:t>
       </w:r>
     </w:p>
   </w:comment>
-  <w:comment w:id="56" w:author="Claude" w:date="2026-10-26T14:00:00.000Z">
+  <w:comment w:id="63" w:author="Claude" w:date="2026-10-26T14:00:00.000Z">
     <w:p>
       <w:r>
         <w:t xml:space="preserve">Round 8: Human, Medium confidence (0.989). Round 6, same words: Human, Medium. Mine. I left it: nearly High (0.985 or more).</w:t>
       </w:r>
     </w:p>
   </w:comment>
-  <w:comment w:id="57" w:author="Claude" w:date="2026-10-26T14:00:00.000Z">
-    <w:p>
-      <w:r>
-        <w:t xml:space="preserve">My pass: a cut, nothing added. Round 8 read: r8w088 Human, Low (0.829) "That's easy to lose sight of when you've spent so long looking at them."; r8w089 Human, Medium (0.909) "And you aren't alone."; r8w087 Human, Medium (0.989), his guide's "You are more than your pain and your past.", stays. The tell: a follow-up that explains the line before it, and a short reassurance the next sentence says concretely. It keeps his guide's line, being patient and gentle, and that there's help and other people doing the same work (you aren't alone); it drops the explanation of why that's hard to see, and "And you aren't alone.", which the next sentence says concretely. Its block is not checked yet.</w:t>
-      </w:r>
-    </w:p>
-  </w:comment>
-  <w:comment w:id="58" w:author="Claude" w:date="2026-10-26T14:00:00.000Z">
+  <w:comment w:id="64" w:author="Claude" w:date="2026-10-26T14:00:00.000Z">
+    <w:p>
+      <w:r>
+        <w:t xml:space="preserve">My pass: a cut, nothing added. Round 8 read: r8w088 Human, Low (0.829) "That's easy to lose sight of when you've spent so long looking at them."; r8w089 Human, Medium (0.909) "And you aren't alone."; r8w087 Human, Medium (0.989), his guide's "You are more than your pain and your past.", stays. The tell: a follow-up that explains the line before it, and a short reassurance the next sentence says concretely. It keeps his guide's line, being patient and gentle, and that there's help and other people doing the same work (you aren't alone); it drops the explanation of why that's hard to see, and "And you aren't alone.", which the next sentence says concretely. Checked with its block after the change (https://www.pangram.com/history/0e1da836-533c-45fc-8119-9e54ad641234): Human Written, 0.00% AI. In this paragraph: Human, Medium (28 words) on "You are more than your pain and your past. There’s help, and lots of other people are out ".</w:t>
+      </w:r>
+    </w:p>
+  </w:comment>
+  <w:comment w:id="65" w:author="Claude" w:date="2026-10-26T14:00:00.000Z">
+    <w:p>
+      <w:r>
+        <w:t xml:space="preserve">After my change, the check of this block alone (without the rest of the guide) read this Human, Medium confidence.</w:t>
+      </w:r>
+    </w:p>
+  </w:comment>
+  <w:comment w:id="66" w:author="Claude" w:date="2026-10-26T14:00:00.000Z">
     <w:p>
       <w:r>
         <w:t xml:space="preserve">Round 8: Human, Medium confidence (0.989). Round 6, same words: Human, Medium. Mine. I left it: nearly High (0.985 or more).</w:t>
       </w:r>
     </w:p>
   </w:comment>
-  <w:comment w:id="59" w:author="Claude" w:date="2026-10-26T14:00:00.000Z">
+  <w:comment w:id="67" w:author="Claude" w:date="2026-10-26T14:00:00.000Z">
     <w:p>
       <w:r>
         <w:t xml:space="preserve">Round 8: Human, Medium confidence (0.986). Round 6, same words: Human, Medium. Mine. I left it: nearly High (0.985 or more).</w:t>

</xml_diff>

<commit_message>
Inner Child turn 115: the docx's comments speak to Joel
The fix records name him in the third person ("his guide's line"); the docx's comments now say "your".

Co-Authored-By: Claude Opus 5.5 <noreply@anthropic.com>
Claude-Session: https://claude.ai/code/session_01NbUfhcTaRT8sbjyYV1wEFq
</commit_message>
<xml_diff>
--- a/articles/inner-child-therapy/experiments/t115-docx/inner-child-spots-round8.docx
+++ b/articles/inner-child-therapy/experiments/t115-docx/inner-child-spots-round8.docx
@@ -5549,7 +5549,7 @@
   <w:comment w:id="2" w:author="Claude" w:date="2026-10-26T14:00:00.000Z">
     <w:p>
       <w:r>
-        <w:t xml:space="preserve">My pass: a cut, nothing added. Round 8 read: r8w005 Human, Medium (0.950) "The cushion was practice for it."; r8w004 Human, Medium (0.982) "Say your boss asks you to stay late again." stays. The tell: an aphoristic closer that sums up. It keeps that reparenting goes on in ordinary life, and the boss example; it drops the cushion's credit as practice for that moment. Checked with its block after the change (https://www.pangram.com/history/8ebeb962-bf21-4080-b20b-2dec350e0561): Human Written, 0.00% AI. In this paragraph: Human, Medium (9 words) on "Say your boss asks you to stay late again.".</w:t>
+        <w:t xml:space="preserve">My pass: a cut, nothing added. Round 8 read: r8w005 Human, Medium (0.950) "The cushion was practice for it."; r8w004 Human, Medium (0.982) "Say your boss asks you to stay late again." stays. The tell: an aphoristic closer that sums up. It keeps that reparenting goes on in ordinary life, and the boss example; it drops the cushion's credit as practice for that moment. Checked with its block after the change (https://www.pangram.com/history/8ebeb962-bf21-4080-b20b-2dec350e0561): Human Written, 0.00% AI. In tyour paragraph: Human, Medium (9 words) on "Say your boss asks you to stay late again.".</w:t>
       </w:r>
     </w:p>
   </w:comment>
@@ -5605,7 +5605,7 @@
   <w:comment w:id="10" w:author="Claude" w:date="2026-10-26T14:00:00.000Z">
     <w:p>
       <w:r>
-        <w:t xml:space="preserve">My pass: its point said plainly. Round 8 read: r8w015 Human, Medium (0.981) "Maybe you're more worn out now, or missing whatever helped back then. (No example? Try another doorway.)". The tell: a question answered with a short knock-down, in parentheses. It keeps the pointer to the other doorways for a reader with no example; "Maybe you're more worn out now ..." stays, the grounding's point that past strength doesn't cancel today's limits; it drops nothing. Checked with its block after the change (https://www.pangram.com/history/33231c23-2cb5-4f24-93bc-8023153ce108): Human Written, 0.00% AI. In this paragraph: Human, Medium (9 words) on "(If no example comes to mind, try another doorway.)".</w:t>
+        <w:t xml:space="preserve">My pass: its point said plainly. Round 8 read: r8w015 Human, Medium (0.981) "Maybe you're more worn out now, or missing whatever helped back then. (No example? Try another doorway.)". The tell: a question answered with a short knock-down, in parentheses. It keeps the pointer to the other doorways for a reader with no example; "Maybe you're more worn out now ..." stays, the grounding's point that past strength doesn't cancel today's limits; it drops nothing. Checked with its block after the change (https://www.pangram.com/history/33231c23-2cb5-4f24-93bc-8023153ce108): Human Written, 0.00% AI. In tyour paragraph: Human, Medium (9 words) on "(If no example comes to mind, try another doorway.)".</w:t>
       </w:r>
     </w:p>
   </w:comment>
@@ -5619,14 +5619,14 @@
   <w:comment w:id="12" w:author="Claude" w:date="2026-10-26T14:00:00.000Z">
     <w:p>
       <w:r>
-        <w:t xml:space="preserve">My pass: a cut, nothing added. Round 8 read: r8w016 Human, Medium (0.943) "I hate myself." If that's what you find, it deserves an honest hearing. Just listen to it, without arguing back.". The tell: a stock phrase ("deserves an honest hearing") and a follow-up that restates it. It keeps listening to the "I hate myself" part without arguing back, which is what an honest hearing is; it drops nothing. Checked with its block after the change (https://www.pangram.com/history/cfd5e3ca-91b3-4382-88be-85c6fb594c52): Human Written, 0.00% AI. In this paragraph: every window over it Human, High.</w:t>
+        <w:t xml:space="preserve">My pass: a cut, nothing added. Round 8 read: r8w016 Human, Medium (0.943) "I hate myself." If that's what you find, it deserves an honest hearing. Just listen to it, without arguing back.". The tell: a stock phrase ("deserves an honest hearing") and a follow-up that restates it. It keeps listening to the "I hate myself" part without arguing back, which is what an honest hearing is; it drops nothing. Checked with its block after the change (https://www.pangram.com/history/cfd5e3ca-91b3-4382-88be-85c6fb594c52): Human Written, 0.00% AI. In tyour paragraph: every window over it Human, High.</w:t>
       </w:r>
     </w:p>
   </w:comment>
   <w:comment w:id="13" w:author="Claude" w:date="2026-10-26T14:00:00.000Z">
     <w:p>
       <w:r>
-        <w:t xml:space="preserve">My pass: a cut, nothing added. Round 8 read: r8w019 Human, Medium (0.974) "You don't need to decide which.". The tell: a reassuring permission ("You don't need to ...") between the list and the step. It keeps the list of what brought you here, and asking that part what it hoped for, which needs no decision first; it drops the explicit permission. Checked with its block after the change (https://www.pangram.com/history/cfd5e3ca-91b3-4382-88be-85c6fb594c52): Human Written, 0.00% AI. In this paragraph: Human, Medium (3 words) on "What was it?".</w:t>
+        <w:t xml:space="preserve">My pass: a cut, nothing added. Round 8 read: r8w019 Human, Medium (0.974) "You don't need to decide which.". The tell: a reassuring permission ("You don't need to ...") between the list and the step. It keeps the list of what brought you here, and asking that part what it hoped for, which needs no decision first; it drops the explicit permission. Checked with its block after the change (https://www.pangram.com/history/cfd5e3ca-91b3-4382-88be-85c6fb594c52): Human Written, 0.00% AI. In tyour paragraph: Human, Medium (3 words) on "What was it?".</w:t>
       </w:r>
     </w:p>
   </w:comment>
@@ -5640,14 +5640,14 @@
   <w:comment w:id="15" w:author="Claude" w:date="2026-10-26T14:00:00.000Z">
     <w:p>
       <w:r>
-        <w:t xml:space="preserve">My pass: a cut, nothing added. Round 8 read: r8w021 Human, Low (0.829) "And if nothing moves at all, don't push it."; r8w020 Human, Medium (0.980) "Watch how it lands, though." stays. The tell: a short tidy instruction between the image and the reassurance, the shape image, advice, comfort. It keeps the aunt and the uncle (the one who just sits there is the one the child climbs on: no pushing), and "Knowing that love is in you somewhere counts for a lot", which is what counts when nothing moves; it drops the words "don't push it", which the aunt and the uncle already show. Checked with its block after the change (https://www.pangram.com/history/51d04a39-9289-47e5-a581-7853cffc332d): Human Written, 0.00% AI. In this paragraph: every window over it Human, High.</w:t>
+        <w:t xml:space="preserve">My pass: a cut, nothing added. Round 8 read: r8w021 Human, Low (0.829) "And if nothing moves at all, don't push it."; r8w020 Human, Medium (0.980) "Watch how it lands, though." stays. The tell: a short tidy instruction between the image and the reassurance, the shape image, advice, comfort. It keeps the aunt and the uncle (the one who just sits there is the one the child climbs on: no pushing), and "Knowing that love is in you somewhere counts for a lot", which is what counts when nothing moves; it drops the words "don't push it", which the aunt and the uncle already show. Checked with its block after the change (https://www.pangram.com/history/51d04a39-9289-47e5-a581-7853cffc332d): Human Written, 0.00% AI. In tyour paragraph: every window over it Human, High.</w:t>
       </w:r>
     </w:p>
   </w:comment>
   <w:comment w:id="16" w:author="Claude" w:date="2026-10-26T14:00:00.000Z">
     <w:p>
       <w:r>
-        <w:t xml:space="preserve">My pass: its point said plainly. Round 8 read: r8w022 AI, Low (0.668), its first two sentences; r8w023 Human, Medium (0.933), "That's how you learn as a kid, and it works now, too.". The tell: an instruction wrapped in an image ("hand it to yourself"), filler ("then for now just try"), the example packaged as "If the advice was ..." and a reassuring follow-up ("and it works now, too"). It keeps the step (one small piece of the advice you'd give them, done yourself), the sleep example with its numbers, and scaffolding with its link; it drops "That's how you learn as a kid, and it works now, too." The scaffolding link says what it said: small steps are how people learn.. Checked with its block after the change (https://www.pangram.com/history/51d04a39-9289-47e5-a581-7853cffc332d): Human Written, 0.00% AI. In this paragraph: every window over it Human, High.</w:t>
+        <w:t xml:space="preserve">My pass: its point said plainly. Round 8 read: r8w022 AI, Low (0.668), its first two sentences; r8w023 Human, Medium (0.933), "That's how you learn as a kid, and it works now, too.". The tell: an instruction wrapped in an image ("hand it to yourself"), filler ("then for now just try"), the example packaged as "If the advice was ..." and a reassuring follow-up ("and it works now, too"). It keeps the step (one small piece of the advice you'd give them, done yourself), the sleep example with its numbers, and scaffolding with its link; it drops "That's how you learn as a kid, and it works now, too." The scaffolding link says what it said: small steps are how people learn.. Checked with its block after the change (https://www.pangram.com/history/51d04a39-9289-47e5-a581-7853cffc332d): Human Written, 0.00% AI. In tyour paragraph: every window over it Human, High.</w:t>
       </w:r>
     </w:p>
   </w:comment>
@@ -5682,7 +5682,7 @@
   <w:comment w:id="21" w:author="Claude" w:date="2026-10-26T14:00:00.000Z">
     <w:p>
       <w:r>
-        <w:t xml:space="preserve">My pass: a cut, nothing added. Round 8 read: r8w030 Human, Low (0.503), its second and third sentences; r8w031 Human, Low (0.848) "The complaint might only be one sentence, once the swearing runs out.". The tell: a short balanced instruction ("If it's something serious, answer it seriously."), a tidy prediction that the next sentence explains anyway, and (try 2, after try 1's check read it Low) the permission packaging "You don't have to accept every conclusion they reach about you, but do ...". It keeps listening for the concrete complaint without fighting the swearing, and why the swearing stops; answering what's serious is said by P5 ("take whatever's true in the anger seriously") and shown by Mr. Rogers in the next paragraph ("he does answer what's worth answering in it"), and not accepting every conclusion is shown there too ("He doesn't collapse under that or fight it"); it drops the hedged prediction that the complaint might only be one sentence, which nothing relies on, and the explicit permission not to accept every conclusion, which the Mr. Rogers paragraph shows. Checked with its block after the change (https://www.pangram.com/history/b695880a-a675-4047-8b89-5f0b92d39fee): Mostly Human Written, 2.44% AI. In this paragraph: Human, Medium (40 words) on "Listen for the concrete complaint without fighting the yelling and swearing around it. Lik".</w:t>
+        <w:t xml:space="preserve">My pass: a cut, nothing added. Round 8 read: r8w030 Human, Low (0.503), its second and third sentences; r8w031 Human, Low (0.848) "The complaint might only be one sentence, once the swearing runs out.". The tell: a short balanced instruction ("If it's something serious, answer it seriously."), a tidy prediction that the next sentence explains anyway, and (try 2, after try 1's check read it Low) the permission packaging "You don't have to accept every conclusion they reach about you, but do ...". It keeps listening for the concrete complaint without fighting the swearing, and why the swearing stops; answering what's serious is said by P5 ("take whatever's true in the anger seriously") and shown by Mr. Rogers in the next paragraph ("he does answer what's worth answering in it"), and not accepting every conclusion is shown there too ("He doesn't collapse under that or fight it"); it drops the hedged prediction that the complaint might only be one sentence, which nothing relies on, and the explicit permission not to accept every conclusion, which the Mr. Rogers paragraph shows. Checked with its block after the change (https://www.pangram.com/history/b695880a-a675-4047-8b89-5f0b92d39fee): Mostly Human Written, 2.44% AI. In tyour paragraph: Human, Medium (40 words) on "Listen for the concrete complaint without fighting the yelling and swearing around it. Lik".</w:t>
       </w:r>
     </w:p>
   </w:comment>
@@ -5794,7 +5794,7 @@
   <w:comment w:id="37" w:author="Claude" w:date="2026-10-26T14:00:00.000Z">
     <w:p>
       <w:r>
-        <w:t xml:space="preserve">My pass: its point said plainly. Round 8 read: r8w048 Human, Low (0.503) "Can't tell if that's you?"; r8w049 to r8w051 AI, Low (0.503 to 0.595), its last three sentences. The tell: a question answered with a short knock-down ("Can't tell if that's you? Treat it like it is."), and a disclaimer followed by a reframe ("None of that is me answering ... It just keeps ..."), the not-X, it-just-Y shape. It keeps every safety instruction and its order; the grounding's MUSTs (a crisis line counts; if you can't tell whether it's you, do the same, as if it is); his guide's two points, that this isn't an answer to whether life is worth living and that it keeps the question open long enough to look at; it drops nothing; "That isn't my answer" is now said by "keeps the question ... open". Checked with its block after the change (https://www.pangram.com/history/25417671-a332-4fea-9f90-64719e1634a8): Human Written, 0.00% AI. In this paragraph: Human, Medium (18 words) on "Getting safe first keeps the question of whether life is worth living open long enough to ".</w:t>
+        <w:t xml:space="preserve">My pass: its point said plainly. Round 8 read: r8w048 Human, Low (0.503) "Can't tell if that's you?"; r8w049 to r8w051 AI, Low (0.503 to 0.595), its last three sentences. The tell: a question answered with a short knock-down ("Can't tell if that's you? Treat it like it is."), and a disclaimer followed by a reframe ("None of that is me answering ... It just keeps ..."), the not-X, it-just-Y shape. It keeps every safety instruction and its order; the grounding's MUSTs (a crisis line counts; if you can't tell whether it's you, do the same, as if it is); your guide's two points, that this isn't an answer to whether life is worth living and that it keeps the question open long enough to look at; it drops nothing; "That isn't my answer" is now said by "keeps the question ... open". Checked with its block after the change (https://www.pangram.com/history/25417671-a332-4fea-9f90-64719e1634a8): Human Written, 0.00% AI. In tyour paragraph: Human, Medium (18 words) on "Getting safe first keeps the question of whether life is worth living open long enough to ".</w:t>
       </w:r>
     </w:p>
   </w:comment>
@@ -5927,7 +5927,7 @@
   <w:comment w:id="56" w:author="Claude" w:date="2026-10-26T14:00:00.000Z">
     <w:p>
       <w:r>
-        <w:t xml:space="preserve">My pass: its point said plainly. Round 8 read: r8w076 Human, Low (0.868) "What felt scared when I wrote it can read like a threat from over there.". The tell: a balanced inversion closer (felt scared here, reads like a threat over there). It keeps the reason to read it as them: what was fear when you wrote it can land as a threat; it drops nothing. Checked with its block after the change (https://www.pangram.com/history/7dce7368-9d9a-4c19-82ef-afe877a45b84): Human Written, 0.00% AI. In this paragraph: every window over it Human, High.</w:t>
+        <w:t xml:space="preserve">My pass: its point said plainly. Round 8 read: r8w076 Human, Low (0.868) "What felt scared when I wrote it can read like a threat from over there.". The tell: a balanced inversion closer (felt scared here, reads like a threat over there). It keeps the reason to read it as them: what was fear when you wrote it can land as a threat; it drops nothing. Checked with its block after the change (https://www.pangram.com/history/7dce7368-9d9a-4c19-82ef-afe877a45b84): Human Written, 0.00% AI. In tyour paragraph: every window over it Human, High.</w:t>
       </w:r>
     </w:p>
   </w:comment>
@@ -5955,7 +5955,7 @@
   <w:comment w:id="60" w:author="Claude" w:date="2026-10-26T14:00:00.000Z">
     <w:p>
       <w:r>
-        <w:t xml:space="preserve">My pass: its point said plainly. Round 8 read: r8w082 Human, Low (0.855) "Seeing how they got there doesn't make it okay."; r8w081 Human, Medium (0.961), its first sentence; r8w083 Human, Medium (0.984) stays. The tell: a short knock-down sentence after a balanced "still ... still" sentence. It keeps accountability, the hurt, and that understanding how they got there doesn't excuse it, said about the people in one sentence; it drops nothing. Checked with its block after the change (https://www.pangram.com/history/edbd62c5-6b07-4b8e-9b51-41cffff43818): Human Written, 0.00% AI. In this paragraph: Human, Medium (3 words) on "Or the skills.".</w:t>
+        <w:t xml:space="preserve">My pass: its point said plainly. Round 8 read: r8w082 Human, Low (0.855) "Seeing how they got there doesn't make it okay."; r8w081 Human, Medium (0.961), its first sentence; r8w083 Human, Medium (0.984) stays. The tell: a short knock-down sentence after a balanced "still ... still" sentence. It keeps accountability, the hurt, and that understanding how they got there doesn't excuse it, said about the people in one sentence; it drops nothing. Checked with its block after the change (https://www.pangram.com/history/edbd62c5-6b07-4b8e-9b51-41cffff43818): Human Written, 0.00% AI. In tyour paragraph: Human, Medium (3 words) on "Or the skills.".</w:t>
       </w:r>
     </w:p>
   </w:comment>
@@ -5983,7 +5983,7 @@
   <w:comment w:id="64" w:author="Claude" w:date="2026-10-26T14:00:00.000Z">
     <w:p>
       <w:r>
-        <w:t xml:space="preserve">My pass: a cut, nothing added. Round 8 read: r8w088 Human, Low (0.829) "That's easy to lose sight of when you've spent so long looking at them."; r8w089 Human, Medium (0.909) "And you aren't alone."; r8w087 Human, Medium (0.989), his guide's "You are more than your pain and your past.", stays. The tell: a follow-up that explains the line before it, and a short reassurance the next sentence says concretely. It keeps his guide's line, being patient and gentle, and that there's help and other people doing the same work (you aren't alone); it drops the explanation of why that's hard to see, and "And you aren't alone.", which the next sentence says concretely. Checked with its block after the change (https://www.pangram.com/history/0e1da836-533c-45fc-8119-9e54ad641234): Human Written, 0.00% AI. In this paragraph: Human, Medium (28 words) on "You are more than your pain and your past. There’s help, and lots of other people are out ".</w:t>
+        <w:t xml:space="preserve">My pass: a cut, nothing added. Round 8 read: r8w088 Human, Low (0.829) "That's easy to lose sight of when you've spent so long looking at them."; r8w089 Human, Medium (0.909) "And you aren't alone."; r8w087 Human, Medium (0.989), your guide's "You are more than your pain and your past.", stays. The tell: a follow-up that explains the line before it, and a short reassurance the next sentence says concretely. It keeps your guide's line, being patient and gentle, and that there's help and other people doing the same work (you aren't alone); it drops the explanation of why that's hard to see, and "And you aren't alone.", which the next sentence says concretely. Checked with its block after the change (https://www.pangram.com/history/0e1da836-533c-45fc-8119-9e54ad641234): Human Written, 0.00% AI. In tyour paragraph: Human, Medium (28 words) on "You are more than your pain and your past. There’s help, and lots of other people are out ".</w:t>
       </w:r>
     </w:p>
   </w:comment>

</xml_diff>